<commit_message>
Culminada revisión de los códigos en R
</commit_message>
<xml_diff>
--- a/bookdown/Observaciones de Bernardo.docx
+++ b/bookdown/Observaciones de Bernardo.docx
@@ -3121,33 +3121,7 @@
           <w:sz w:val="36"/>
           <w:szCs w:val="36"/>
         </w:rPr>
-        <w:t xml:space="preserve"> Detección de </w:t>
-      </w:r>
-      <w:proofErr w:type="spellStart"/>
-      <w:r>
-        <w:rPr>
-          <w:rFonts w:ascii="Helvetica" w:hAnsi="Helvetica" w:cs="Helvetica"/>
-          <w:b/>
-          <w:bCs/>
-          <w:color w:val="333333"/>
-          <w:spacing w:val="3"/>
-          <w:sz w:val="36"/>
-          <w:szCs w:val="36"/>
-        </w:rPr>
-        <w:t>outliers</w:t>
-      </w:r>
-      <w:proofErr w:type="spellEnd"/>
-      <w:r>
-        <w:rPr>
-          <w:rFonts w:ascii="Helvetica" w:hAnsi="Helvetica" w:cs="Helvetica"/>
-          <w:b/>
-          <w:bCs/>
-          <w:color w:val="333333"/>
-          <w:spacing w:val="3"/>
-          <w:sz w:val="36"/>
-          <w:szCs w:val="36"/>
-        </w:rPr>
-        <w:t xml:space="preserve"> en R</w:t>
+        <w:t> Detección de outliers en R</w:t>
       </w:r>
     </w:p>
     <w:p>
@@ -4677,6 +4651,7 @@
           <w:color w:val="5B9BD5" w:themeColor="accent1"/>
         </w:rPr>
       </w:pPr>
+      <w:proofErr w:type="spellStart"/>
       <w:proofErr w:type="gramStart"/>
       <w:r>
         <w:rPr>
@@ -4684,7 +4659,16 @@
           <w:rFonts w:ascii="Lucida Console" w:hAnsi="Lucida Console"/>
           <w:color w:val="5B9BD5" w:themeColor="accent1"/>
         </w:rPr>
-        <w:t>plot(</w:t>
+        <w:t>plot</w:t>
+      </w:r>
+      <w:proofErr w:type="spellEnd"/>
+      <w:r>
+        <w:rPr>
+          <w:rStyle w:val="gnkrckgcmrb"/>
+          <w:rFonts w:ascii="Lucida Console" w:hAnsi="Lucida Console"/>
+          <w:color w:val="5B9BD5" w:themeColor="accent1"/>
+        </w:rPr>
+        <w:t>(</w:t>
       </w:r>
       <w:proofErr w:type="spellStart"/>
       <w:proofErr w:type="gramEnd"/>
@@ -4821,75 +4805,29 @@
           <w:sz w:val="36"/>
           <w:szCs w:val="36"/>
         </w:rPr>
-        <w:t xml:space="preserve"> Detección de </w:t>
-      </w:r>
-      <w:proofErr w:type="spellStart"/>
-      <w:r>
+        <w:t> Detección de outliers en Python</w:t>
+      </w:r>
+    </w:p>
+    <w:p>
+      <w:pPr>
+        <w:pStyle w:val="NormalWeb"/>
+        <w:shd w:val="clear" w:color="auto" w:fill="FFFFFF"/>
+        <w:spacing w:before="0" w:beforeAutospacing="0" w:after="204" w:afterAutospacing="0"/>
         <w:rPr>
           <w:rFonts w:ascii="Helvetica" w:hAnsi="Helvetica" w:cs="Helvetica"/>
-          <w:b/>
-          <w:bCs/>
-          <w:color w:val="333333"/>
-          <w:spacing w:val="3"/>
-          <w:sz w:val="36"/>
-          <w:szCs w:val="36"/>
-        </w:rPr>
-        <w:t>outliers</w:t>
-      </w:r>
-      <w:proofErr w:type="spellEnd"/>
+          <w:color w:val="333333"/>
+          <w:spacing w:val="3"/>
+          <w:shd w:val="clear" w:color="auto" w:fill="FFFFFF"/>
+        </w:rPr>
+      </w:pPr>
       <w:r>
         <w:rPr>
           <w:rFonts w:ascii="Helvetica" w:hAnsi="Helvetica" w:cs="Helvetica"/>
-          <w:b/>
-          <w:bCs/>
-          <w:color w:val="333333"/>
-          <w:spacing w:val="3"/>
-          <w:sz w:val="36"/>
-          <w:szCs w:val="36"/>
-        </w:rPr>
-        <w:t xml:space="preserve"> en Python</w:t>
-      </w:r>
-    </w:p>
-    <w:p>
-      <w:pPr>
-        <w:pStyle w:val="NormalWeb"/>
-        <w:shd w:val="clear" w:color="auto" w:fill="FFFFFF"/>
-        <w:spacing w:before="0" w:beforeAutospacing="0" w:after="204" w:afterAutospacing="0"/>
-        <w:rPr>
-          <w:rFonts w:ascii="Helvetica" w:hAnsi="Helvetica" w:cs="Helvetica"/>
           <w:color w:val="333333"/>
           <w:spacing w:val="3"/>
           <w:shd w:val="clear" w:color="auto" w:fill="FFFFFF"/>
         </w:rPr>
-      </w:pPr>
-      <w:r>
-        <w:rPr>
-          <w:rFonts w:ascii="Helvetica" w:hAnsi="Helvetica" w:cs="Helvetica"/>
-          <w:color w:val="333333"/>
-          <w:spacing w:val="3"/>
-          <w:shd w:val="clear" w:color="auto" w:fill="FFFFFF"/>
-        </w:rPr>
-        <w:t xml:space="preserve">Visual: Para identificar </w:t>
-      </w:r>
-      <w:proofErr w:type="spellStart"/>
-      <w:r>
-        <w:rPr>
-          <w:rFonts w:ascii="Helvetica" w:hAnsi="Helvetica" w:cs="Helvetica"/>
-          <w:color w:val="333333"/>
-          <w:spacing w:val="3"/>
-          <w:shd w:val="clear" w:color="auto" w:fill="FFFFFF"/>
-        </w:rPr>
-        <w:t>outliers</w:t>
-      </w:r>
-      <w:proofErr w:type="spellEnd"/>
-      <w:r>
-        <w:rPr>
-          <w:rFonts w:ascii="Helvetica" w:hAnsi="Helvetica" w:cs="Helvetica"/>
-          <w:color w:val="333333"/>
-          <w:spacing w:val="3"/>
-          <w:shd w:val="clear" w:color="auto" w:fill="FFFFFF"/>
-        </w:rPr>
-        <w:t xml:space="preserve"> de manera visual en </w:t>
+        <w:t>Visual: Para identificar outliers de manera visual en </w:t>
       </w:r>
       <w:r>
         <w:rPr>
@@ -18087,6 +18025,7 @@
           <w:lang w:eastAsia="es-VE"/>
         </w:rPr>
       </w:pPr>
+      <w:proofErr w:type="spellStart"/>
       <w:proofErr w:type="gramStart"/>
       <w:r>
         <w:rPr>
@@ -18095,7 +18034,17 @@
           <w:color w:val="0070C0"/>
           <w:highlight w:val="yellow"/>
         </w:rPr>
-        <w:t>plot(</w:t>
+        <w:t>plot</w:t>
+      </w:r>
+      <w:proofErr w:type="spellEnd"/>
+      <w:r>
+        <w:rPr>
+          <w:rStyle w:val="gnkrckgcmrb"/>
+          <w:rFonts w:ascii="Lucida Console" w:hAnsi="Lucida Console"/>
+          <w:color w:val="0070C0"/>
+          <w:highlight w:val="yellow"/>
+        </w:rPr>
+        <w:t>(</w:t>
       </w:r>
       <w:proofErr w:type="gramEnd"/>
       <w:r>
@@ -19295,6 +19244,7 @@
           <w:lang w:eastAsia="es-VE"/>
         </w:rPr>
       </w:pPr>
+      <w:proofErr w:type="spellStart"/>
       <w:proofErr w:type="gramStart"/>
       <w:r>
         <w:rPr>
@@ -19304,7 +19254,18 @@
           <w:szCs w:val="20"/>
           <w:lang w:eastAsia="es-VE"/>
         </w:rPr>
-        <w:t>plot(</w:t>
+        <w:t>plot</w:t>
+      </w:r>
+      <w:proofErr w:type="spellEnd"/>
+      <w:r>
+        <w:rPr>
+          <w:rFonts w:ascii="Lucida Console" w:eastAsia="Times New Roman" w:hAnsi="Lucida Console" w:cs="Courier New"/>
+          <w:color w:val="0000FF"/>
+          <w:sz w:val="20"/>
+          <w:szCs w:val="20"/>
+          <w:lang w:eastAsia="es-VE"/>
+        </w:rPr>
+        <w:t>(</w:t>
       </w:r>
       <w:proofErr w:type="gramEnd"/>
       <w:r>
@@ -23235,16 +23196,15 @@
           <w:spacing w:val="3"/>
           <w:highlight w:val="yellow"/>
         </w:rPr>
-        <w:t>co</w:t>
+        <w:t>construcción</w:t>
       </w:r>
       <w:r>
         <w:rPr>
           <w:rFonts w:ascii="Helvetica" w:hAnsi="Helvetica" w:cs="Helvetica"/>
           <w:color w:val="333333"/>
           <w:spacing w:val="3"/>
-          <w:highlight w:val="yellow"/>
-        </w:rPr>
-        <w:t>n</w:t>
+        </w:rPr>
+        <w:t xml:space="preserve"> de </w:t>
       </w:r>
       <w:r>
         <w:rPr>
@@ -23253,33 +23213,7 @@
           <w:spacing w:val="3"/>
           <w:highlight w:val="yellow"/>
         </w:rPr>
-        <w:t>strucción</w:t>
-      </w:r>
-      <w:r>
-        <w:rPr>
-          <w:rFonts w:ascii="Helvetica" w:hAnsi="Helvetica" w:cs="Helvetica"/>
-          <w:color w:val="333333"/>
-          <w:spacing w:val="3"/>
-        </w:rPr>
-        <w:t xml:space="preserve"> de </w:t>
-      </w:r>
-      <w:r>
-        <w:rPr>
-          <w:rFonts w:ascii="Helvetica" w:hAnsi="Helvetica" w:cs="Helvetica"/>
-          <w:color w:val="333333"/>
-          <w:spacing w:val="3"/>
-          <w:highlight w:val="yellow"/>
-        </w:rPr>
-        <w:t>á</w:t>
-      </w:r>
-      <w:r>
-        <w:rPr>
-          <w:rFonts w:ascii="Helvetica" w:hAnsi="Helvetica" w:cs="Helvetica"/>
-          <w:color w:val="333333"/>
-          <w:spacing w:val="3"/>
-          <w:highlight w:val="yellow"/>
-        </w:rPr>
-        <w:t>rboles</w:t>
+        <w:t>árboles</w:t>
       </w:r>
       <w:r>
         <w:rPr>
@@ -23324,14 +23258,22 @@
           <w:color w:val="333333"/>
           <w:spacing w:val="3"/>
         </w:rPr>
-        <w:t>)</w:t>
-      </w:r>
-      <w:r>
-        <w:rPr>
-          <w:rStyle w:val="nfasis"/>
+        <w:t xml:space="preserve">) </w:t>
+      </w:r>
+      <w:r>
+        <w:rPr>
           <w:rFonts w:ascii="Helvetica" w:hAnsi="Helvetica" w:cs="Helvetica"/>
           <w:color w:val="333333"/>
           <w:spacing w:val="3"/>
+          <w:highlight w:val="yellow"/>
+        </w:rPr>
+        <w:t>con</w:t>
+      </w:r>
+      <w:r>
+        <w:rPr>
+          <w:rFonts w:ascii="Helvetica" w:hAnsi="Helvetica" w:cs="Helvetica"/>
+          <w:color w:val="333333"/>
+          <w:spacing w:val="3"/>
         </w:rPr>
         <w:t xml:space="preserve"> </w:t>
       </w:r>
@@ -23342,7 +23284,7 @@
           <w:spacing w:val="3"/>
           <w:highlight w:val="yellow"/>
         </w:rPr>
-        <w:t>con</w:t>
+        <w:t>una</w:t>
       </w:r>
       <w:r>
         <w:rPr>
@@ -23359,42 +23301,7 @@
           <w:spacing w:val="3"/>
           <w:highlight w:val="yellow"/>
         </w:rPr>
-        <w:t>una</w:t>
-      </w:r>
-      <w:r>
-        <w:rPr>
-          <w:rFonts w:ascii="Helvetica" w:hAnsi="Helvetica" w:cs="Helvetica"/>
-          <w:color w:val="333333"/>
-          <w:spacing w:val="3"/>
-        </w:rPr>
-        <w:t xml:space="preserve"> </w:t>
-      </w:r>
-      <w:r>
-        <w:rPr>
-          <w:rFonts w:ascii="Helvetica" w:hAnsi="Helvetica" w:cs="Helvetica"/>
-          <w:color w:val="333333"/>
-          <w:spacing w:val="3"/>
-          <w:highlight w:val="yellow"/>
-        </w:rPr>
-        <w:t>s</w:t>
-      </w:r>
-      <w:r>
-        <w:rPr>
-          <w:rFonts w:ascii="Helvetica" w:hAnsi="Helvetica" w:cs="Helvetica"/>
-          <w:color w:val="333333"/>
-          <w:spacing w:val="3"/>
-          <w:highlight w:val="yellow"/>
-        </w:rPr>
-        <w:t>i</w:t>
-      </w:r>
-      <w:r>
-        <w:rPr>
-          <w:rFonts w:ascii="Helvetica" w:hAnsi="Helvetica" w:cs="Helvetica"/>
-          <w:color w:val="333333"/>
-          <w:spacing w:val="3"/>
-          <w:highlight w:val="yellow"/>
-        </w:rPr>
-        <w:t>ntaxis</w:t>
+        <w:t>sintaxis</w:t>
       </w:r>
       <w:r>
         <w:rPr>
@@ -23656,18 +23563,11 @@
           <w:color w:val="5B9BD5" w:themeColor="accent1"/>
         </w:rPr>
       </w:pPr>
-    </w:p>
-    <w:p>
-      <w:pPr>
-        <w:rPr>
-          <w:color w:val="5B9BD5" w:themeColor="accent1"/>
-        </w:rPr>
-      </w:pPr>
-      <w:r>
-        <w:rPr>
-          <w:color w:val="5B9BD5" w:themeColor="accent1"/>
-          <w:highlight w:val="yellow"/>
-        </w:rPr>
+      <w:r>
+        <w:rPr>
+          <w:color w:val="5B9BD5" w:themeColor="accent1"/>
+        </w:rPr>
+        <w:lastRenderedPageBreak/>
         <w:t>Data=iris</w:t>
       </w:r>
     </w:p>
@@ -23682,6 +23582,83 @@
         <w:rPr>
           <w:color w:val="5B9BD5" w:themeColor="accent1"/>
         </w:rPr>
+        <w:t>A</w:t>
+      </w:r>
+      <w:r>
+        <w:rPr>
+          <w:color w:val="5B9BD5" w:themeColor="accent1"/>
+        </w:rPr>
+        <w:t>rbol</w:t>
+      </w:r>
+      <w:proofErr w:type="spellEnd"/>
+      <w:r>
+        <w:rPr>
+          <w:color w:val="5B9BD5" w:themeColor="accent1"/>
+        </w:rPr>
+        <w:t>=C5.0(</w:t>
+      </w:r>
+      <w:proofErr w:type="spellStart"/>
+      <w:r>
+        <w:rPr>
+          <w:color w:val="5B9BD5" w:themeColor="accent1"/>
+        </w:rPr>
+        <w:t>Species</w:t>
+      </w:r>
+      <w:proofErr w:type="spellEnd"/>
+      <w:r>
+        <w:rPr>
+          <w:color w:val="5B9BD5" w:themeColor="accent1"/>
+        </w:rPr>
+        <w:t>~</w:t>
+      </w:r>
+      <w:proofErr w:type="gramStart"/>
+      <w:r>
+        <w:rPr>
+          <w:color w:val="5B9BD5" w:themeColor="accent1"/>
+        </w:rPr>
+        <w:t>.,</w:t>
+      </w:r>
+      <w:proofErr w:type="gramEnd"/>
+      <w:r>
+        <w:rPr>
+          <w:color w:val="5B9BD5" w:themeColor="accent1"/>
+        </w:rPr>
+        <w:t>Data)</w:t>
+      </w:r>
+    </w:p>
+    <w:p>
+      <w:pPr>
+        <w:rPr>
+          <w:color w:val="5B9BD5" w:themeColor="accent1"/>
+        </w:rPr>
+      </w:pPr>
+      <w:proofErr w:type="spellStart"/>
+      <w:proofErr w:type="gramStart"/>
+      <w:r>
+        <w:rPr>
+          <w:color w:val="5B9BD5" w:themeColor="accent1"/>
+        </w:rPr>
+        <w:t>p</w:t>
+      </w:r>
+      <w:r>
+        <w:rPr>
+          <w:color w:val="5B9BD5" w:themeColor="accent1"/>
+        </w:rPr>
+        <w:t>lot</w:t>
+      </w:r>
+      <w:proofErr w:type="spellEnd"/>
+      <w:r>
+        <w:rPr>
+          <w:color w:val="5B9BD5" w:themeColor="accent1"/>
+        </w:rPr>
+        <w:t>(</w:t>
+      </w:r>
+      <w:proofErr w:type="spellStart"/>
+      <w:proofErr w:type="gramEnd"/>
+      <w:r>
+        <w:rPr>
+          <w:color w:val="5B9BD5" w:themeColor="accent1"/>
+        </w:rPr>
         <w:t>Arbol</w:t>
       </w:r>
       <w:proofErr w:type="spellEnd"/>
@@ -23689,65 +23666,15 @@
         <w:rPr>
           <w:color w:val="5B9BD5" w:themeColor="accent1"/>
         </w:rPr>
-        <w:t>=C5.0(</w:t>
-      </w:r>
-      <w:proofErr w:type="spellStart"/>
-      <w:r>
-        <w:rPr>
-          <w:color w:val="5B9BD5" w:themeColor="accent1"/>
-        </w:rPr>
-        <w:t>Species</w:t>
-      </w:r>
-      <w:proofErr w:type="spellEnd"/>
-      <w:r>
-        <w:rPr>
-          <w:color w:val="5B9BD5" w:themeColor="accent1"/>
-        </w:rPr>
-        <w:t>~</w:t>
-      </w:r>
-      <w:proofErr w:type="gramStart"/>
-      <w:r>
-        <w:rPr>
-          <w:color w:val="5B9BD5" w:themeColor="accent1"/>
-        </w:rPr>
-        <w:t>.,</w:t>
-      </w:r>
-      <w:proofErr w:type="gramEnd"/>
-      <w:r>
-        <w:rPr>
-          <w:color w:val="5B9BD5" w:themeColor="accent1"/>
-        </w:rPr>
-        <w:t>Data)</w:t>
-      </w:r>
-    </w:p>
-    <w:p>
-      <w:pPr>
-        <w:rPr>
-          <w:color w:val="5B9BD5" w:themeColor="accent1"/>
-        </w:rPr>
-      </w:pPr>
-      <w:proofErr w:type="gramStart"/>
-      <w:r>
-        <w:rPr>
-          <w:color w:val="5B9BD5" w:themeColor="accent1"/>
-        </w:rPr>
-        <w:t>plot(</w:t>
-      </w:r>
-      <w:proofErr w:type="spellStart"/>
-      <w:proofErr w:type="gramEnd"/>
-      <w:r>
-        <w:rPr>
-          <w:color w:val="5B9BD5" w:themeColor="accent1"/>
-        </w:rPr>
-        <w:t>Arbol</w:t>
-      </w:r>
-      <w:proofErr w:type="spellEnd"/>
-      <w:r>
-        <w:rPr>
-          <w:color w:val="5B9BD5" w:themeColor="accent1"/>
-        </w:rPr>
         <w:t>)</w:t>
       </w:r>
+    </w:p>
+    <w:p>
+      <w:pPr>
+        <w:rPr>
+          <w:color w:val="5B9BD5" w:themeColor="accent1"/>
+        </w:rPr>
+      </w:pPr>
     </w:p>
     <w:p>
       <w:pPr>
@@ -24159,8 +24086,6 @@
         </w:rPr>
         <w:t>### Hacemos la predicción para data1:</w:t>
       </w:r>
-      <w:bookmarkStart w:id="0" w:name="_GoBack"/>
-      <w:bookmarkEnd w:id="0"/>
     </w:p>
     <w:p>
       <w:pPr>
@@ -24349,6 +24274,7 @@
           <w:color w:val="0070C0"/>
           <w:sz w:val="20"/>
           <w:szCs w:val="20"/>
+          <w:bdr w:val="none" w:sz="0" w:space="0" w:color="auto" w:frame="1"/>
           <w:lang w:eastAsia="es-VE"/>
         </w:rPr>
       </w:pPr>
@@ -24467,12 +24393,670 @@
           <w:tab w:val="left" w:pos="14656"/>
         </w:tabs>
         <w:wordWrap w:val="0"/>
-        <w:spacing w:after="0" w:line="240" w:lineRule="atLeast"/>
+        <w:spacing w:after="0" w:line="200" w:lineRule="atLeast"/>
         <w:jc w:val="left"/>
         <w:rPr>
+          <w:rFonts w:ascii="Lucida Console" w:eastAsia="Times New Roman" w:hAnsi="Lucida Console" w:cs="Courier New"/>
           <w:color w:val="0070C0"/>
-        </w:rPr>
-      </w:pPr>
+          <w:sz w:val="20"/>
+          <w:szCs w:val="20"/>
+          <w:bdr w:val="none" w:sz="0" w:space="0" w:color="auto" w:frame="1"/>
+          <w:lang w:eastAsia="es-VE"/>
+        </w:rPr>
+      </w:pPr>
+    </w:p>
+    <w:p>
+      <w:pPr>
+        <w:pStyle w:val="Ttulo3"/>
+        <w:shd w:val="clear" w:color="auto" w:fill="FFFFFF"/>
+        <w:spacing w:before="306" w:after="204"/>
+        <w:rPr>
+          <w:rFonts w:ascii="Helvetica Neue" w:hAnsi="Helvetica Neue"/>
+          <w:color w:val="333333"/>
+          <w:spacing w:val="3"/>
+          <w:sz w:val="36"/>
+          <w:szCs w:val="36"/>
+        </w:rPr>
+      </w:pPr>
+      <w:r>
+        <w:rPr>
+          <w:rStyle w:val="header-section-number"/>
+          <w:rFonts w:ascii="Helvetica Neue" w:hAnsi="Helvetica Neue"/>
+          <w:b/>
+          <w:bCs/>
+          <w:color w:val="333333"/>
+          <w:spacing w:val="3"/>
+          <w:sz w:val="36"/>
+          <w:szCs w:val="36"/>
+        </w:rPr>
+        <w:t>8.1.2</w:t>
+      </w:r>
+      <w:r>
+        <w:rPr>
+          <w:rFonts w:ascii="Helvetica Neue" w:hAnsi="Helvetica Neue"/>
+          <w:b/>
+          <w:bCs/>
+          <w:color w:val="333333"/>
+          <w:spacing w:val="3"/>
+          <w:sz w:val="36"/>
+          <w:szCs w:val="36"/>
+        </w:rPr>
+        <w:t> Arboles de decisión en </w:t>
+      </w:r>
+      <w:r>
+        <w:rPr>
+          <w:rStyle w:val="nfasis"/>
+          <w:rFonts w:ascii="Helvetica Neue" w:hAnsi="Helvetica Neue"/>
+          <w:b/>
+          <w:bCs/>
+          <w:color w:val="333333"/>
+          <w:spacing w:val="3"/>
+          <w:sz w:val="36"/>
+          <w:szCs w:val="36"/>
+        </w:rPr>
+        <w:t>Python</w:t>
+      </w:r>
+    </w:p>
+    <w:p>
+      <w:r>
+        <w:t>Usaremos la librería </w:t>
+      </w:r>
+      <w:proofErr w:type="spellStart"/>
+      <w:r>
+        <w:rPr>
+          <w:rStyle w:val="nfasis"/>
+          <w:rFonts w:ascii="Helvetica Neue" w:hAnsi="Helvetica Neue"/>
+          <w:color w:val="333333"/>
+          <w:spacing w:val="3"/>
+        </w:rPr>
+        <w:t>sklearn</w:t>
+      </w:r>
+      <w:proofErr w:type="spellEnd"/>
+      <w:r>
+        <w:t> y los daros </w:t>
+      </w:r>
+      <w:r>
+        <w:rPr>
+          <w:rStyle w:val="nfasis"/>
+          <w:rFonts w:ascii="Helvetica Neue" w:hAnsi="Helvetica Neue"/>
+          <w:color w:val="333333"/>
+          <w:spacing w:val="3"/>
+        </w:rPr>
+        <w:t>iris</w:t>
+      </w:r>
+      <w:r>
+        <w:t xml:space="preserve">. Se debe separar la variable a predecir de la variable </w:t>
+      </w:r>
+      <w:r>
+        <w:rPr>
+          <w:highlight w:val="yellow"/>
+        </w:rPr>
+        <w:t>independiente</w:t>
+      </w:r>
+      <w:r>
+        <w:t xml:space="preserve"> antes de realizar la construcción del modelo.</w:t>
+      </w:r>
+    </w:p>
+    <w:p/>
+    <w:p>
+      <w:pPr>
+        <w:pStyle w:val="Ttulo2"/>
+        <w:shd w:val="clear" w:color="auto" w:fill="FFFFFF"/>
+        <w:spacing w:before="306" w:beforeAutospacing="0" w:after="204" w:afterAutospacing="0"/>
+        <w:rPr>
+          <w:rFonts w:ascii="Helvetica Neue" w:hAnsi="Helvetica Neue"/>
+          <w:b w:val="0"/>
+          <w:bCs w:val="0"/>
+          <w:color w:val="333333"/>
+          <w:spacing w:val="3"/>
+          <w:sz w:val="42"/>
+          <w:szCs w:val="42"/>
+        </w:rPr>
+      </w:pPr>
+      <w:r>
+        <w:rPr>
+          <w:rStyle w:val="header-section-number"/>
+          <w:rFonts w:ascii="Helvetica Neue" w:hAnsi="Helvetica Neue"/>
+          <w:b w:val="0"/>
+          <w:bCs w:val="0"/>
+          <w:color w:val="333333"/>
+          <w:spacing w:val="3"/>
+          <w:sz w:val="42"/>
+          <w:szCs w:val="42"/>
+        </w:rPr>
+        <w:t>8.2</w:t>
+      </w:r>
+      <w:r>
+        <w:rPr>
+          <w:rFonts w:ascii="Helvetica Neue" w:hAnsi="Helvetica Neue"/>
+          <w:b w:val="0"/>
+          <w:bCs w:val="0"/>
+          <w:color w:val="333333"/>
+          <w:spacing w:val="3"/>
+          <w:sz w:val="42"/>
+          <w:szCs w:val="42"/>
+        </w:rPr>
+        <w:t> Bosques aleatorios</w:t>
+      </w:r>
+      <w:r>
+        <w:rPr>
+          <w:rFonts w:ascii="Helvetica Neue" w:hAnsi="Helvetica Neue"/>
+          <w:b w:val="0"/>
+          <w:bCs w:val="0"/>
+          <w:color w:val="333333"/>
+          <w:spacing w:val="3"/>
+          <w:sz w:val="42"/>
+          <w:szCs w:val="42"/>
+          <w:highlight w:val="yellow"/>
+        </w:rPr>
+        <w:t>.</w:t>
+      </w:r>
+    </w:p>
+    <w:p>
+      <w:pPr>
+        <w:rPr>
+          <w:rFonts w:ascii="Helvetica Neue" w:hAnsi="Helvetica Neue"/>
+          <w:color w:val="333333"/>
+          <w:spacing w:val="3"/>
+          <w:sz w:val="24"/>
+          <w:szCs w:val="24"/>
+          <w:shd w:val="clear" w:color="auto" w:fill="FFFFFF"/>
+        </w:rPr>
+      </w:pPr>
+      <w:r>
+        <w:rPr>
+          <w:rStyle w:val="nfasis"/>
+          <w:rFonts w:ascii="Helvetica Neue" w:hAnsi="Helvetica Neue"/>
+          <w:color w:val="333333"/>
+          <w:spacing w:val="3"/>
+          <w:sz w:val="24"/>
+          <w:szCs w:val="24"/>
+          <w:highlight w:val="yellow"/>
+          <w:shd w:val="clear" w:color="auto" w:fill="FFFFFF"/>
+        </w:rPr>
+        <w:lastRenderedPageBreak/>
+        <w:t>Bosques aleatorios</w:t>
+      </w:r>
+      <w:r>
+        <w:rPr>
+          <w:rFonts w:ascii="Helvetica Neue" w:hAnsi="Helvetica Neue"/>
+          <w:color w:val="333333"/>
+          <w:spacing w:val="3"/>
+          <w:sz w:val="24"/>
+          <w:szCs w:val="24"/>
+          <w:highlight w:val="yellow"/>
+          <w:shd w:val="clear" w:color="auto" w:fill="FFFFFF"/>
+        </w:rPr>
+        <w:t xml:space="preserve"> es una </w:t>
+      </w:r>
+      <w:r>
+        <w:rPr>
+          <w:rFonts w:ascii="Helvetica Neue" w:hAnsi="Helvetica Neue"/>
+          <w:color w:val="333333"/>
+          <w:spacing w:val="3"/>
+          <w:sz w:val="24"/>
+          <w:szCs w:val="24"/>
+          <w:highlight w:val="yellow"/>
+          <w:shd w:val="clear" w:color="auto" w:fill="FFFFFF"/>
+        </w:rPr>
+        <w:t xml:space="preserve">herramienta que combina </w:t>
+      </w:r>
+      <w:r>
+        <w:rPr>
+          <w:rFonts w:ascii="Helvetica Neue" w:hAnsi="Helvetica Neue"/>
+          <w:color w:val="333333"/>
+          <w:spacing w:val="3"/>
+          <w:sz w:val="24"/>
+          <w:szCs w:val="24"/>
+          <w:highlight w:val="yellow"/>
+          <w:shd w:val="clear" w:color="auto" w:fill="FFFFFF"/>
+        </w:rPr>
+        <w:t>árboles de decisión</w:t>
+      </w:r>
+      <w:r>
+        <w:rPr>
+          <w:rFonts w:ascii="Helvetica Neue" w:hAnsi="Helvetica Neue"/>
+          <w:color w:val="333333"/>
+          <w:spacing w:val="3"/>
+          <w:sz w:val="24"/>
+          <w:szCs w:val="24"/>
+          <w:highlight w:val="yellow"/>
+          <w:shd w:val="clear" w:color="auto" w:fill="FFFFFF"/>
+        </w:rPr>
+        <w:t>,</w:t>
+      </w:r>
+      <w:r>
+        <w:rPr>
+          <w:rFonts w:cs="Myriad Pro"/>
+          <w:color w:val="000000"/>
+          <w:sz w:val="24"/>
+          <w:szCs w:val="24"/>
+          <w:highlight w:val="yellow"/>
+        </w:rPr>
+        <w:t xml:space="preserve"> </w:t>
+      </w:r>
+      <w:r>
+        <w:rPr>
+          <w:rFonts w:cs="Myriad Pro"/>
+          <w:color w:val="000000"/>
+          <w:sz w:val="24"/>
+          <w:szCs w:val="24"/>
+          <w:highlight w:val="yellow"/>
+        </w:rPr>
+        <w:t>selecciona</w:t>
+      </w:r>
+      <w:r>
+        <w:rPr>
+          <w:rFonts w:cs="Myriad Pro"/>
+          <w:color w:val="000000"/>
+          <w:sz w:val="24"/>
+          <w:szCs w:val="24"/>
+          <w:highlight w:val="yellow"/>
+        </w:rPr>
+        <w:t>ndo</w:t>
+      </w:r>
+      <w:r>
+        <w:rPr>
+          <w:rFonts w:cs="Myriad Pro"/>
+          <w:color w:val="000000"/>
+          <w:sz w:val="24"/>
+          <w:szCs w:val="24"/>
+          <w:highlight w:val="yellow"/>
+        </w:rPr>
+        <w:t xml:space="preserve"> de manera aleatoria una cantidad de variables con las cuales se construye cada uno de los árboles individuales, y se realizan predicciones con estas variables que posteriormente serán ponderadas a través del cálculo de la clase más votada de los árboles que se generaron, para finalmente hacer la predicción</w:t>
+      </w:r>
+      <w:r>
+        <w:rPr>
+          <w:rFonts w:cs="Myriad Pro"/>
+          <w:color w:val="000000"/>
+          <w:sz w:val="24"/>
+          <w:szCs w:val="24"/>
+          <w:highlight w:val="yellow"/>
+        </w:rPr>
+        <w:t xml:space="preserve">. El método promedia una colección de árboles no correlacionados, o </w:t>
+      </w:r>
+      <w:proofErr w:type="spellStart"/>
+      <w:r>
+        <w:rPr>
+          <w:rFonts w:cs="Myriad Pro"/>
+          <w:i/>
+          <w:color w:val="000000"/>
+          <w:sz w:val="24"/>
+          <w:szCs w:val="24"/>
+          <w:highlight w:val="yellow"/>
+        </w:rPr>
+        <w:t>decorrrelacionados</w:t>
+      </w:r>
+      <w:proofErr w:type="spellEnd"/>
+      <w:r>
+        <w:rPr>
+          <w:rFonts w:cs="Myriad Pro"/>
+          <w:color w:val="000000"/>
+          <w:sz w:val="24"/>
+          <w:szCs w:val="24"/>
+          <w:highlight w:val="yellow"/>
+        </w:rPr>
+        <w:t>, y dónde cada árbol</w:t>
+      </w:r>
+      <w:r>
+        <w:rPr>
+          <w:rFonts w:ascii="Helvetica Neue" w:hAnsi="Helvetica Neue"/>
+          <w:color w:val="333333"/>
+          <w:spacing w:val="3"/>
+          <w:highlight w:val="yellow"/>
+          <w:shd w:val="clear" w:color="auto" w:fill="FFFFFF"/>
+        </w:rPr>
+        <w:t xml:space="preserve"> depende de los valores de un vector aleatorio de la muestra de manera independiente y con la misma distribución de todos los árboles en el bosque</w:t>
+      </w:r>
+      <w:r>
+        <w:rPr>
+          <w:rFonts w:ascii="Helvetica Neue" w:hAnsi="Helvetica Neue"/>
+          <w:color w:val="333333"/>
+          <w:spacing w:val="3"/>
+          <w:highlight w:val="yellow"/>
+          <w:shd w:val="clear" w:color="auto" w:fill="FFFFFF"/>
+        </w:rPr>
+        <w:t xml:space="preserve">. </w:t>
+      </w:r>
+      <w:r>
+        <w:rPr>
+          <w:rFonts w:ascii="Helvetica Neue" w:hAnsi="Helvetica Neue"/>
+          <w:color w:val="333333"/>
+          <w:spacing w:val="3"/>
+          <w:highlight w:val="yellow"/>
+          <w:shd w:val="clear" w:color="auto" w:fill="FFFFFF"/>
+        </w:rPr>
+        <w:t>La generalización del error para los bosques converge a un límite en cuanto el número de árboles en el bosque sea grande. El error de generalización de un bosque de árboles de clasificación depende de la fuerza de los árboles individuales en el bosque y la correlación entre ellos.</w:t>
+      </w:r>
+    </w:p>
+    <w:p>
+      <w:pPr>
+        <w:rPr>
+          <w:rFonts w:ascii="Helvetica Neue" w:hAnsi="Helvetica Neue"/>
+          <w:color w:val="333333"/>
+          <w:spacing w:val="3"/>
+          <w:shd w:val="clear" w:color="auto" w:fill="FFFFFF"/>
+        </w:rPr>
+      </w:pPr>
+    </w:p>
+    <w:p>
+      <w:pPr>
+        <w:pStyle w:val="Ttulo2"/>
+        <w:shd w:val="clear" w:color="auto" w:fill="FFFFFF"/>
+        <w:spacing w:before="306" w:beforeAutospacing="0" w:after="204" w:afterAutospacing="0"/>
+        <w:rPr>
+          <w:rFonts w:ascii="Helvetica Neue" w:hAnsi="Helvetica Neue"/>
+          <w:b w:val="0"/>
+          <w:bCs w:val="0"/>
+          <w:color w:val="333333"/>
+          <w:spacing w:val="3"/>
+          <w:sz w:val="42"/>
+          <w:szCs w:val="42"/>
+        </w:rPr>
+      </w:pPr>
+      <w:r>
+        <w:rPr>
+          <w:rStyle w:val="header-section-number"/>
+          <w:rFonts w:ascii="Helvetica Neue" w:hAnsi="Helvetica Neue"/>
+          <w:b w:val="0"/>
+          <w:bCs w:val="0"/>
+          <w:color w:val="333333"/>
+          <w:spacing w:val="3"/>
+          <w:sz w:val="42"/>
+          <w:szCs w:val="42"/>
+        </w:rPr>
+        <w:t>8.3</w:t>
+      </w:r>
+      <w:r>
+        <w:rPr>
+          <w:rFonts w:ascii="Helvetica Neue" w:hAnsi="Helvetica Neue"/>
+          <w:b w:val="0"/>
+          <w:bCs w:val="0"/>
+          <w:color w:val="333333"/>
+          <w:spacing w:val="3"/>
+          <w:sz w:val="42"/>
+          <w:szCs w:val="42"/>
+        </w:rPr>
+        <w:t> Bosques aleatorios en </w:t>
+      </w:r>
+      <w:r>
+        <w:rPr>
+          <w:rStyle w:val="nfasis"/>
+          <w:rFonts w:ascii="Helvetica Neue" w:hAnsi="Helvetica Neue"/>
+          <w:b w:val="0"/>
+          <w:bCs w:val="0"/>
+          <w:color w:val="333333"/>
+          <w:spacing w:val="3"/>
+          <w:sz w:val="42"/>
+          <w:szCs w:val="42"/>
+        </w:rPr>
+        <w:t>R</w:t>
+      </w:r>
+    </w:p>
+    <w:p>
+      <w:r>
+        <w:t>Para realizar bosques aleatorios en </w:t>
+      </w:r>
+      <w:r>
+        <w:rPr>
+          <w:rStyle w:val="nfasis"/>
+          <w:rFonts w:ascii="Helvetica Neue" w:hAnsi="Helvetica Neue"/>
+          <w:color w:val="333333"/>
+          <w:spacing w:val="3"/>
+        </w:rPr>
+        <w:t>R</w:t>
+      </w:r>
+      <w:r>
+        <w:t> usaremos la librería </w:t>
+      </w:r>
+      <w:proofErr w:type="spellStart"/>
+      <w:r>
+        <w:rPr>
+          <w:rStyle w:val="nfasis"/>
+          <w:rFonts w:ascii="Helvetica Neue" w:hAnsi="Helvetica Neue"/>
+          <w:color w:val="333333"/>
+          <w:spacing w:val="3"/>
+        </w:rPr>
+        <w:t>randomForest</w:t>
+      </w:r>
+      <w:proofErr w:type="spellEnd"/>
+      <w:r>
+        <w:t> la cual facilita la sintaxis necesaria para construir el modelo</w:t>
+      </w:r>
+      <w:r>
+        <w:rPr>
+          <w:highlight w:val="yellow"/>
+        </w:rPr>
+        <w:t>. Los datos corresponden a la base de</w:t>
+      </w:r>
+      <w:r>
+        <w:t xml:space="preserve"> </w:t>
+      </w:r>
+      <w:r>
+        <w:t>datos </w:t>
+      </w:r>
+      <w:r>
+        <w:rPr>
+          <w:rStyle w:val="nfasis"/>
+          <w:rFonts w:ascii="Helvetica Neue" w:hAnsi="Helvetica Neue"/>
+          <w:color w:val="333333"/>
+          <w:spacing w:val="3"/>
+        </w:rPr>
+        <w:t>iris</w:t>
+      </w:r>
+      <w:r>
+        <w:t xml:space="preserve"> </w:t>
+      </w:r>
+      <w:r>
+        <w:rPr>
+          <w:highlight w:val="yellow"/>
+        </w:rPr>
+        <w:t>y</w:t>
+      </w:r>
+      <w:r>
+        <w:t xml:space="preserve"> se debe separar la variable independiente de las dependientes para luego usar la función </w:t>
+      </w:r>
+      <w:proofErr w:type="spellStart"/>
+      <w:proofErr w:type="gramStart"/>
+      <w:r>
+        <w:rPr>
+          <w:rStyle w:val="nfasis"/>
+          <w:rFonts w:ascii="Helvetica Neue" w:hAnsi="Helvetica Neue"/>
+          <w:color w:val="333333"/>
+          <w:spacing w:val="3"/>
+        </w:rPr>
+        <w:t>randomForest</w:t>
+      </w:r>
+      <w:proofErr w:type="spellEnd"/>
+      <w:r>
+        <w:rPr>
+          <w:rStyle w:val="nfasis"/>
+          <w:rFonts w:ascii="Helvetica Neue" w:hAnsi="Helvetica Neue"/>
+          <w:color w:val="333333"/>
+          <w:spacing w:val="3"/>
+        </w:rPr>
+        <w:t>(</w:t>
+      </w:r>
+      <w:proofErr w:type="gramEnd"/>
+      <w:r>
+        <w:rPr>
+          <w:rStyle w:val="nfasis"/>
+          <w:rFonts w:ascii="Helvetica Neue" w:hAnsi="Helvetica Neue"/>
+          <w:color w:val="333333"/>
+          <w:spacing w:val="3"/>
+        </w:rPr>
+        <w:t>)</w:t>
+      </w:r>
+      <w:r>
+        <w:t> para construir el modelo</w:t>
+      </w:r>
+      <w:r>
+        <w:rPr>
+          <w:highlight w:val="yellow"/>
+        </w:rPr>
+        <w:t>. É</w:t>
+      </w:r>
+      <w:r>
+        <w:t>sta función necesita como parámetros las variables independientes y la variable dependiente junto a</w:t>
+      </w:r>
+      <w:r>
+        <w:t xml:space="preserve">l número de </w:t>
+      </w:r>
+      <w:r>
+        <w:rPr>
+          <w:highlight w:val="yellow"/>
+        </w:rPr>
+        <w:t>á</w:t>
+      </w:r>
+      <w:r>
+        <w:rPr>
+          <w:highlight w:val="yellow"/>
+        </w:rPr>
+        <w:t>rboles a pro</w:t>
+      </w:r>
+      <w:r>
+        <w:rPr>
+          <w:highlight w:val="yellow"/>
+        </w:rPr>
+        <w:t>mediar</w:t>
+      </w:r>
+      <w:r>
+        <w:t>. Anexamos el código para este proceso:</w:t>
+      </w:r>
+    </w:p>
+    <w:p>
+      <w:pPr>
+        <w:pStyle w:val="Default"/>
+      </w:pPr>
+    </w:p>
+    <w:p>
+      <w:r>
+        <w:t xml:space="preserve"> </w:t>
+      </w:r>
+    </w:p>
+    <w:p/>
+    <w:p>
+      <w:pPr>
+        <w:rPr>
+          <w:sz w:val="24"/>
+          <w:szCs w:val="24"/>
+        </w:rPr>
+      </w:pPr>
+      <w:r>
+        <w:rPr>
+          <w:noProof/>
+          <w:lang w:eastAsia="es-VE"/>
+        </w:rPr>
+        <w:drawing>
+          <wp:inline distT="0" distB="0" distL="0" distR="0" wp14:anchorId="1BBA9055" wp14:editId="6F661176">
+            <wp:extent cx="5612130" cy="1364158"/>
+            <wp:effectExtent l="0" t="0" r="7620" b="7620"/>
+            <wp:docPr id="32" name="Imagen 32" descr="C:\Users\Bernardo\Documents\Machine-Learning-Basico\docs\images\arb8.png"/>
+            <wp:cNvGraphicFramePr>
+              <a:graphicFrameLocks xmlns:a="http://schemas.openxmlformats.org/drawingml/2006/main" noChangeAspect="1"/>
+            </wp:cNvGraphicFramePr>
+            <a:graphic xmlns:a="http://schemas.openxmlformats.org/drawingml/2006/main">
+              <a:graphicData uri="http://schemas.openxmlformats.org/drawingml/2006/picture">
+                <pic:pic xmlns:pic="http://schemas.openxmlformats.org/drawingml/2006/picture">
+                  <pic:nvPicPr>
+                    <pic:cNvPr id="0" name="Picture 1" descr="C:\Users\Bernardo\Documents\Machine-Learning-Basico\docs\images\arb8.png"/>
+                    <pic:cNvPicPr>
+                      <a:picLocks noChangeAspect="1" noChangeArrowheads="1"/>
+                    </pic:cNvPicPr>
+                  </pic:nvPicPr>
+                  <pic:blipFill>
+                    <a:blip r:embed="rId49" cstate="print">
+                      <a:extLst>
+                        <a:ext uri="{28A0092B-C50C-407E-A947-70E740481C1C}">
+                          <a14:useLocalDpi xmlns:a14="http://schemas.microsoft.com/office/drawing/2010/main" val="0"/>
+                        </a:ext>
+                      </a:extLst>
+                    </a:blip>
+                    <a:srcRect/>
+                    <a:stretch>
+                      <a:fillRect/>
+                    </a:stretch>
+                  </pic:blipFill>
+                  <pic:spPr bwMode="auto">
+                    <a:xfrm>
+                      <a:off x="0" y="0"/>
+                      <a:ext cx="5612130" cy="1364158"/>
+                    </a:xfrm>
+                    <a:prstGeom prst="rect">
+                      <a:avLst/>
+                    </a:prstGeom>
+                    <a:noFill/>
+                    <a:ln>
+                      <a:noFill/>
+                    </a:ln>
+                  </pic:spPr>
+                </pic:pic>
+              </a:graphicData>
+            </a:graphic>
+          </wp:inline>
+        </w:drawing>
+      </w:r>
+    </w:p>
+    <w:p>
+      <w:pPr>
+        <w:rPr>
+          <w:rFonts w:ascii="Helvetica Neue" w:hAnsi="Helvetica Neue"/>
+          <w:color w:val="0070C0"/>
+          <w:spacing w:val="3"/>
+          <w:shd w:val="clear" w:color="auto" w:fill="FFFFFF"/>
+        </w:rPr>
+      </w:pPr>
+      <w:proofErr w:type="spellStart"/>
+      <w:proofErr w:type="gramStart"/>
+      <w:r>
+        <w:rPr>
+          <w:rFonts w:ascii="Helvetica Neue" w:hAnsi="Helvetica Neue"/>
+          <w:color w:val="0070C0"/>
+          <w:spacing w:val="3"/>
+          <w:shd w:val="clear" w:color="auto" w:fill="FFFFFF"/>
+        </w:rPr>
+        <w:t>l</w:t>
+      </w:r>
+      <w:r>
+        <w:rPr>
+          <w:rFonts w:ascii="Helvetica Neue" w:hAnsi="Helvetica Neue"/>
+          <w:color w:val="0070C0"/>
+          <w:spacing w:val="3"/>
+          <w:shd w:val="clear" w:color="auto" w:fill="FFFFFF"/>
+        </w:rPr>
+        <w:t>ibrary</w:t>
+      </w:r>
+      <w:proofErr w:type="spellEnd"/>
+      <w:r>
+        <w:rPr>
+          <w:rFonts w:ascii="Helvetica Neue" w:hAnsi="Helvetica Neue"/>
+          <w:color w:val="0070C0"/>
+          <w:spacing w:val="3"/>
+          <w:shd w:val="clear" w:color="auto" w:fill="FFFFFF"/>
+        </w:rPr>
+        <w:t>(</w:t>
+      </w:r>
+      <w:proofErr w:type="spellStart"/>
+      <w:proofErr w:type="gramEnd"/>
+      <w:r>
+        <w:rPr>
+          <w:rFonts w:ascii="Helvetica Neue" w:hAnsi="Helvetica Neue"/>
+          <w:color w:val="0070C0"/>
+          <w:spacing w:val="3"/>
+          <w:shd w:val="clear" w:color="auto" w:fill="FFFFFF"/>
+        </w:rPr>
+        <w:t>randomForest</w:t>
+      </w:r>
+      <w:proofErr w:type="spellEnd"/>
+      <w:r>
+        <w:rPr>
+          <w:rFonts w:ascii="Helvetica Neue" w:hAnsi="Helvetica Neue"/>
+          <w:color w:val="0070C0"/>
+          <w:spacing w:val="3"/>
+          <w:shd w:val="clear" w:color="auto" w:fill="FFFFFF"/>
+        </w:rPr>
+        <w:t>)</w:t>
+      </w:r>
     </w:p>
     <w:p>
       <w:pPr>
@@ -24496,9 +25080,60 @@
           <w:tab w:val="left" w:pos="14656"/>
         </w:tabs>
         <w:wordWrap w:val="0"/>
-        <w:spacing w:after="0" w:line="240" w:lineRule="atLeast"/>
+        <w:spacing w:after="0" w:line="200" w:lineRule="atLeast"/>
         <w:jc w:val="left"/>
-      </w:pPr>
+        <w:rPr>
+          <w:rFonts w:ascii="Lucida Console" w:eastAsia="Times New Roman" w:hAnsi="Lucida Console" w:cs="Courier New"/>
+          <w:color w:val="0000FF"/>
+          <w:sz w:val="20"/>
+          <w:szCs w:val="20"/>
+          <w:lang w:eastAsia="es-VE"/>
+        </w:rPr>
+      </w:pPr>
+      <w:proofErr w:type="spellStart"/>
+      <w:r>
+        <w:rPr>
+          <w:rFonts w:ascii="Lucida Console" w:eastAsia="Times New Roman" w:hAnsi="Lucida Console" w:cs="Courier New"/>
+          <w:color w:val="0000FF"/>
+          <w:sz w:val="20"/>
+          <w:szCs w:val="20"/>
+          <w:lang w:eastAsia="es-VE"/>
+        </w:rPr>
+        <w:t>Predictoras</w:t>
+      </w:r>
+      <w:proofErr w:type="spellEnd"/>
+      <w:r>
+        <w:rPr>
+          <w:rFonts w:ascii="Lucida Console" w:eastAsia="Times New Roman" w:hAnsi="Lucida Console" w:cs="Courier New"/>
+          <w:color w:val="0000FF"/>
+          <w:sz w:val="20"/>
+          <w:szCs w:val="20"/>
+          <w:lang w:eastAsia="es-VE"/>
+        </w:rPr>
+        <w:t>=</w:t>
+      </w:r>
+      <w:proofErr w:type="gramStart"/>
+      <w:r>
+        <w:rPr>
+          <w:rFonts w:ascii="Lucida Console" w:eastAsia="Times New Roman" w:hAnsi="Lucida Console" w:cs="Courier New"/>
+          <w:color w:val="0000FF"/>
+          <w:sz w:val="20"/>
+          <w:szCs w:val="20"/>
+          <w:lang w:eastAsia="es-VE"/>
+        </w:rPr>
+        <w:t>iris[</w:t>
+      </w:r>
+      <w:proofErr w:type="gramEnd"/>
+      <w:r>
+        <w:rPr>
+          <w:rFonts w:ascii="Lucida Console" w:eastAsia="Times New Roman" w:hAnsi="Lucida Console" w:cs="Courier New"/>
+          <w:color w:val="0000FF"/>
+          <w:sz w:val="20"/>
+          <w:szCs w:val="20"/>
+          <w:lang w:eastAsia="es-VE"/>
+        </w:rPr>
+        <w:t>,1:4]</w:t>
+      </w:r>
     </w:p>
     <w:p>
       <w:pPr>
@@ -24522,9 +25157,48 @@
           <w:tab w:val="left" w:pos="14656"/>
         </w:tabs>
         <w:wordWrap w:val="0"/>
-        <w:spacing w:after="0" w:line="240" w:lineRule="atLeast"/>
+        <w:spacing w:after="0" w:line="200" w:lineRule="atLeast"/>
         <w:jc w:val="left"/>
-      </w:pPr>
+        <w:rPr>
+          <w:rFonts w:ascii="Lucida Console" w:eastAsia="Times New Roman" w:hAnsi="Lucida Console" w:cs="Courier New"/>
+          <w:color w:val="0000FF"/>
+          <w:sz w:val="20"/>
+          <w:szCs w:val="20"/>
+          <w:lang w:eastAsia="es-VE"/>
+        </w:rPr>
+      </w:pPr>
+      <w:r>
+        <w:rPr>
+          <w:rFonts w:ascii="Lucida Console" w:eastAsia="Times New Roman" w:hAnsi="Lucida Console" w:cs="Courier New"/>
+          <w:color w:val="0000FF"/>
+          <w:sz w:val="20"/>
+          <w:szCs w:val="20"/>
+          <w:lang w:eastAsia="es-VE"/>
+        </w:rPr>
+        <w:t xml:space="preserve">Objetivo = </w:t>
+      </w:r>
+      <w:proofErr w:type="gramStart"/>
+      <w:r>
+        <w:rPr>
+          <w:rFonts w:ascii="Lucida Console" w:eastAsia="Times New Roman" w:hAnsi="Lucida Console" w:cs="Courier New"/>
+          <w:color w:val="0000FF"/>
+          <w:sz w:val="20"/>
+          <w:szCs w:val="20"/>
+          <w:lang w:eastAsia="es-VE"/>
+        </w:rPr>
+        <w:t>iris[</w:t>
+      </w:r>
+      <w:proofErr w:type="gramEnd"/>
+      <w:r>
+        <w:rPr>
+          <w:rFonts w:ascii="Lucida Console" w:eastAsia="Times New Roman" w:hAnsi="Lucida Console" w:cs="Courier New"/>
+          <w:color w:val="0000FF"/>
+          <w:sz w:val="20"/>
+          <w:szCs w:val="20"/>
+          <w:lang w:eastAsia="es-VE"/>
+        </w:rPr>
+        <w:t>,5]</w:t>
+      </w:r>
     </w:p>
     <w:p>
       <w:pPr>
@@ -24548,9 +25222,2240 @@
           <w:tab w:val="left" w:pos="14656"/>
         </w:tabs>
         <w:wordWrap w:val="0"/>
+        <w:spacing w:after="0" w:line="200" w:lineRule="atLeast"/>
+        <w:jc w:val="left"/>
+        <w:rPr>
+          <w:rFonts w:ascii="Lucida Console" w:eastAsia="Times New Roman" w:hAnsi="Lucida Console" w:cs="Courier New"/>
+          <w:color w:val="000000"/>
+          <w:sz w:val="20"/>
+          <w:szCs w:val="20"/>
+          <w:lang w:eastAsia="es-VE"/>
+        </w:rPr>
+      </w:pPr>
+      <w:proofErr w:type="spellStart"/>
+      <w:proofErr w:type="gramStart"/>
+      <w:r>
+        <w:rPr>
+          <w:rFonts w:ascii="Lucida Console" w:eastAsia="Times New Roman" w:hAnsi="Lucida Console" w:cs="Courier New"/>
+          <w:color w:val="0000FF"/>
+          <w:sz w:val="20"/>
+          <w:szCs w:val="20"/>
+          <w:lang w:eastAsia="es-VE"/>
+        </w:rPr>
+        <w:t>rf</w:t>
+      </w:r>
+      <w:proofErr w:type="spellEnd"/>
+      <w:proofErr w:type="gramEnd"/>
+      <w:r>
+        <w:rPr>
+          <w:rFonts w:ascii="Lucida Console" w:eastAsia="Times New Roman" w:hAnsi="Lucida Console" w:cs="Courier New"/>
+          <w:color w:val="0000FF"/>
+          <w:sz w:val="20"/>
+          <w:szCs w:val="20"/>
+          <w:lang w:eastAsia="es-VE"/>
+        </w:rPr>
+        <w:t>&lt;-</w:t>
+      </w:r>
+      <w:proofErr w:type="spellStart"/>
+      <w:r>
+        <w:rPr>
+          <w:rFonts w:ascii="Lucida Console" w:eastAsia="Times New Roman" w:hAnsi="Lucida Console" w:cs="Courier New"/>
+          <w:color w:val="0000FF"/>
+          <w:sz w:val="20"/>
+          <w:szCs w:val="20"/>
+          <w:lang w:eastAsia="es-VE"/>
+        </w:rPr>
+        <w:t>randomForest</w:t>
+      </w:r>
+      <w:proofErr w:type="spellEnd"/>
+      <w:r>
+        <w:rPr>
+          <w:rFonts w:ascii="Lucida Console" w:eastAsia="Times New Roman" w:hAnsi="Lucida Console" w:cs="Courier New"/>
+          <w:color w:val="0000FF"/>
+          <w:sz w:val="20"/>
+          <w:szCs w:val="20"/>
+          <w:lang w:eastAsia="es-VE"/>
+        </w:rPr>
+        <w:t xml:space="preserve">(x= </w:t>
+      </w:r>
+      <w:proofErr w:type="spellStart"/>
+      <w:r>
+        <w:rPr>
+          <w:rFonts w:ascii="Lucida Console" w:eastAsia="Times New Roman" w:hAnsi="Lucida Console" w:cs="Courier New"/>
+          <w:color w:val="0000FF"/>
+          <w:sz w:val="20"/>
+          <w:szCs w:val="20"/>
+          <w:lang w:eastAsia="es-VE"/>
+        </w:rPr>
+        <w:t>Predictoras</w:t>
+      </w:r>
+      <w:proofErr w:type="spellEnd"/>
+      <w:r>
+        <w:rPr>
+          <w:rFonts w:ascii="Lucida Console" w:eastAsia="Times New Roman" w:hAnsi="Lucida Console" w:cs="Courier New"/>
+          <w:color w:val="0000FF"/>
+          <w:sz w:val="20"/>
+          <w:szCs w:val="20"/>
+          <w:lang w:eastAsia="es-VE"/>
+        </w:rPr>
+        <w:t xml:space="preserve">, y = Objetivo, </w:t>
+      </w:r>
+      <w:proofErr w:type="spellStart"/>
+      <w:r>
+        <w:rPr>
+          <w:rFonts w:ascii="Lucida Console" w:eastAsia="Times New Roman" w:hAnsi="Lucida Console" w:cs="Courier New"/>
+          <w:color w:val="0000FF"/>
+          <w:sz w:val="20"/>
+          <w:szCs w:val="20"/>
+          <w:lang w:eastAsia="es-VE"/>
+        </w:rPr>
+        <w:t>ntree</w:t>
+      </w:r>
+      <w:proofErr w:type="spellEnd"/>
+      <w:r>
+        <w:rPr>
+          <w:rFonts w:ascii="Lucida Console" w:eastAsia="Times New Roman" w:hAnsi="Lucida Console" w:cs="Courier New"/>
+          <w:color w:val="0000FF"/>
+          <w:sz w:val="20"/>
+          <w:szCs w:val="20"/>
+          <w:lang w:eastAsia="es-VE"/>
+        </w:rPr>
+        <w:t xml:space="preserve"> =500)</w:t>
+      </w:r>
+    </w:p>
+    <w:p>
+      <w:pPr>
+        <w:shd w:val="clear" w:color="auto" w:fill="FFFFFF"/>
+        <w:tabs>
+          <w:tab w:val="left" w:pos="916"/>
+          <w:tab w:val="left" w:pos="1832"/>
+          <w:tab w:val="left" w:pos="2748"/>
+          <w:tab w:val="left" w:pos="3664"/>
+          <w:tab w:val="left" w:pos="4580"/>
+          <w:tab w:val="left" w:pos="5496"/>
+          <w:tab w:val="left" w:pos="6412"/>
+          <w:tab w:val="left" w:pos="7328"/>
+          <w:tab w:val="left" w:pos="8244"/>
+          <w:tab w:val="left" w:pos="9160"/>
+          <w:tab w:val="left" w:pos="10076"/>
+          <w:tab w:val="left" w:pos="10992"/>
+          <w:tab w:val="left" w:pos="11908"/>
+          <w:tab w:val="left" w:pos="12824"/>
+          <w:tab w:val="left" w:pos="13740"/>
+          <w:tab w:val="left" w:pos="14656"/>
+        </w:tabs>
+        <w:wordWrap w:val="0"/>
         <w:spacing w:after="0" w:line="240" w:lineRule="atLeast"/>
         <w:jc w:val="left"/>
       </w:pPr>
+    </w:p>
+    <w:p>
+      <w:pPr>
+        <w:shd w:val="clear" w:color="auto" w:fill="FFFFFF"/>
+        <w:tabs>
+          <w:tab w:val="left" w:pos="916"/>
+          <w:tab w:val="left" w:pos="1832"/>
+          <w:tab w:val="left" w:pos="2748"/>
+          <w:tab w:val="left" w:pos="3664"/>
+          <w:tab w:val="left" w:pos="4580"/>
+          <w:tab w:val="left" w:pos="5496"/>
+          <w:tab w:val="left" w:pos="6412"/>
+          <w:tab w:val="left" w:pos="7328"/>
+          <w:tab w:val="left" w:pos="8244"/>
+          <w:tab w:val="left" w:pos="9160"/>
+          <w:tab w:val="left" w:pos="10076"/>
+          <w:tab w:val="left" w:pos="10992"/>
+          <w:tab w:val="left" w:pos="11908"/>
+          <w:tab w:val="left" w:pos="12824"/>
+          <w:tab w:val="left" w:pos="13740"/>
+          <w:tab w:val="left" w:pos="14656"/>
+        </w:tabs>
+        <w:wordWrap w:val="0"/>
+        <w:spacing w:after="0" w:line="240" w:lineRule="atLeast"/>
+        <w:jc w:val="left"/>
+        <w:rPr>
+          <w:rFonts w:ascii="Helvetica Neue" w:hAnsi="Helvetica Neue"/>
+          <w:color w:val="333333"/>
+          <w:spacing w:val="3"/>
+          <w:shd w:val="clear" w:color="auto" w:fill="FFFFFF"/>
+        </w:rPr>
+      </w:pPr>
+      <w:r>
+        <w:rPr>
+          <w:rFonts w:ascii="Helvetica Neue" w:hAnsi="Helvetica Neue"/>
+          <w:color w:val="333333"/>
+          <w:spacing w:val="3"/>
+          <w:shd w:val="clear" w:color="auto" w:fill="FFFFFF"/>
+        </w:rPr>
+        <w:t>Al realizar el </w:t>
+      </w:r>
+      <w:proofErr w:type="spellStart"/>
+      <w:r>
+        <w:rPr>
+          <w:rStyle w:val="nfasis"/>
+          <w:rFonts w:ascii="Helvetica Neue" w:hAnsi="Helvetica Neue"/>
+          <w:color w:val="333333"/>
+          <w:spacing w:val="3"/>
+          <w:shd w:val="clear" w:color="auto" w:fill="FFFFFF"/>
+        </w:rPr>
+        <w:t>print</w:t>
+      </w:r>
+      <w:proofErr w:type="spellEnd"/>
+      <w:r>
+        <w:rPr>
+          <w:rFonts w:ascii="Helvetica Neue" w:hAnsi="Helvetica Neue"/>
+          <w:color w:val="333333"/>
+          <w:spacing w:val="3"/>
+          <w:shd w:val="clear" w:color="auto" w:fill="FFFFFF"/>
+        </w:rPr>
+        <w:t> modelo obtenemos:</w:t>
+      </w:r>
+    </w:p>
+    <w:p>
+      <w:pPr>
+        <w:shd w:val="clear" w:color="auto" w:fill="FFFFFF"/>
+        <w:tabs>
+          <w:tab w:val="left" w:pos="916"/>
+          <w:tab w:val="left" w:pos="1832"/>
+          <w:tab w:val="left" w:pos="2748"/>
+          <w:tab w:val="left" w:pos="3664"/>
+          <w:tab w:val="left" w:pos="4580"/>
+          <w:tab w:val="left" w:pos="5496"/>
+          <w:tab w:val="left" w:pos="6412"/>
+          <w:tab w:val="left" w:pos="7328"/>
+          <w:tab w:val="left" w:pos="8244"/>
+          <w:tab w:val="left" w:pos="9160"/>
+          <w:tab w:val="left" w:pos="10076"/>
+          <w:tab w:val="left" w:pos="10992"/>
+          <w:tab w:val="left" w:pos="11908"/>
+          <w:tab w:val="left" w:pos="12824"/>
+          <w:tab w:val="left" w:pos="13740"/>
+          <w:tab w:val="left" w:pos="14656"/>
+        </w:tabs>
+        <w:wordWrap w:val="0"/>
+        <w:spacing w:after="0" w:line="200" w:lineRule="atLeast"/>
+        <w:jc w:val="left"/>
+        <w:rPr>
+          <w:rFonts w:ascii="Lucida Console" w:eastAsia="Times New Roman" w:hAnsi="Lucida Console" w:cs="Courier New"/>
+          <w:sz w:val="20"/>
+          <w:szCs w:val="20"/>
+          <w:lang w:eastAsia="es-VE"/>
+        </w:rPr>
+      </w:pPr>
+      <w:proofErr w:type="spellStart"/>
+      <w:proofErr w:type="gramStart"/>
+      <w:r>
+        <w:rPr>
+          <w:rFonts w:ascii="Lucida Console" w:eastAsia="Times New Roman" w:hAnsi="Lucida Console" w:cs="Courier New"/>
+          <w:sz w:val="20"/>
+          <w:szCs w:val="20"/>
+          <w:highlight w:val="yellow"/>
+          <w:lang w:eastAsia="es-VE"/>
+        </w:rPr>
+        <w:t>print</w:t>
+      </w:r>
+      <w:proofErr w:type="spellEnd"/>
+      <w:r>
+        <w:rPr>
+          <w:rFonts w:ascii="Lucida Console" w:eastAsia="Times New Roman" w:hAnsi="Lucida Console" w:cs="Courier New"/>
+          <w:sz w:val="20"/>
+          <w:szCs w:val="20"/>
+          <w:highlight w:val="yellow"/>
+          <w:lang w:eastAsia="es-VE"/>
+        </w:rPr>
+        <w:t>(</w:t>
+      </w:r>
+      <w:proofErr w:type="spellStart"/>
+      <w:proofErr w:type="gramEnd"/>
+      <w:r>
+        <w:rPr>
+          <w:rFonts w:ascii="Lucida Console" w:eastAsia="Times New Roman" w:hAnsi="Lucida Console" w:cs="Courier New"/>
+          <w:sz w:val="20"/>
+          <w:szCs w:val="20"/>
+          <w:highlight w:val="yellow"/>
+          <w:lang w:eastAsia="es-VE"/>
+        </w:rPr>
+        <w:t>rf</w:t>
+      </w:r>
+      <w:proofErr w:type="spellEnd"/>
+      <w:r>
+        <w:rPr>
+          <w:rFonts w:ascii="Lucida Console" w:eastAsia="Times New Roman" w:hAnsi="Lucida Console" w:cs="Courier New"/>
+          <w:sz w:val="20"/>
+          <w:szCs w:val="20"/>
+          <w:highlight w:val="yellow"/>
+          <w:lang w:eastAsia="es-VE"/>
+        </w:rPr>
+        <w:t>)</w:t>
+      </w:r>
+    </w:p>
+    <w:p>
+      <w:pPr>
+        <w:shd w:val="clear" w:color="auto" w:fill="FFFFFF"/>
+        <w:tabs>
+          <w:tab w:val="left" w:pos="916"/>
+          <w:tab w:val="left" w:pos="1832"/>
+          <w:tab w:val="left" w:pos="2748"/>
+          <w:tab w:val="left" w:pos="3664"/>
+          <w:tab w:val="left" w:pos="4580"/>
+          <w:tab w:val="left" w:pos="5496"/>
+          <w:tab w:val="left" w:pos="6412"/>
+          <w:tab w:val="left" w:pos="7328"/>
+          <w:tab w:val="left" w:pos="8244"/>
+          <w:tab w:val="left" w:pos="9160"/>
+          <w:tab w:val="left" w:pos="10076"/>
+          <w:tab w:val="left" w:pos="10992"/>
+          <w:tab w:val="left" w:pos="11908"/>
+          <w:tab w:val="left" w:pos="12824"/>
+          <w:tab w:val="left" w:pos="13740"/>
+          <w:tab w:val="left" w:pos="14656"/>
+        </w:tabs>
+        <w:wordWrap w:val="0"/>
+        <w:spacing w:after="0" w:line="240" w:lineRule="atLeast"/>
+        <w:jc w:val="left"/>
+        <w:rPr>
+          <w:rFonts w:ascii="Helvetica Neue" w:hAnsi="Helvetica Neue"/>
+          <w:color w:val="333333"/>
+          <w:spacing w:val="3"/>
+          <w:shd w:val="clear" w:color="auto" w:fill="FFFFFF"/>
+        </w:rPr>
+      </w:pPr>
+    </w:p>
+    <w:p>
+      <w:pPr>
+        <w:shd w:val="clear" w:color="auto" w:fill="FFFFFF"/>
+        <w:tabs>
+          <w:tab w:val="left" w:pos="916"/>
+          <w:tab w:val="left" w:pos="1832"/>
+          <w:tab w:val="left" w:pos="2748"/>
+          <w:tab w:val="left" w:pos="3664"/>
+          <w:tab w:val="left" w:pos="4580"/>
+          <w:tab w:val="left" w:pos="5496"/>
+          <w:tab w:val="left" w:pos="6412"/>
+          <w:tab w:val="left" w:pos="7328"/>
+          <w:tab w:val="left" w:pos="8244"/>
+          <w:tab w:val="left" w:pos="9160"/>
+          <w:tab w:val="left" w:pos="10076"/>
+          <w:tab w:val="left" w:pos="10992"/>
+          <w:tab w:val="left" w:pos="11908"/>
+          <w:tab w:val="left" w:pos="12824"/>
+          <w:tab w:val="left" w:pos="13740"/>
+          <w:tab w:val="left" w:pos="14656"/>
+        </w:tabs>
+        <w:wordWrap w:val="0"/>
+        <w:spacing w:after="0" w:line="240" w:lineRule="atLeast"/>
+        <w:jc w:val="left"/>
+        <w:rPr>
+          <w:rFonts w:ascii="Helvetica Neue" w:hAnsi="Helvetica Neue"/>
+          <w:color w:val="333333"/>
+          <w:spacing w:val="3"/>
+          <w:shd w:val="clear" w:color="auto" w:fill="FFFFFF"/>
+        </w:rPr>
+      </w:pPr>
+    </w:p>
+    <w:p>
+      <w:pPr>
+        <w:shd w:val="clear" w:color="auto" w:fill="FFFFFF"/>
+        <w:tabs>
+          <w:tab w:val="left" w:pos="916"/>
+          <w:tab w:val="left" w:pos="1832"/>
+          <w:tab w:val="left" w:pos="2748"/>
+          <w:tab w:val="left" w:pos="3664"/>
+          <w:tab w:val="left" w:pos="4580"/>
+          <w:tab w:val="left" w:pos="5496"/>
+          <w:tab w:val="left" w:pos="6412"/>
+          <w:tab w:val="left" w:pos="7328"/>
+          <w:tab w:val="left" w:pos="8244"/>
+          <w:tab w:val="left" w:pos="9160"/>
+          <w:tab w:val="left" w:pos="10076"/>
+          <w:tab w:val="left" w:pos="10992"/>
+          <w:tab w:val="left" w:pos="11908"/>
+          <w:tab w:val="left" w:pos="12824"/>
+          <w:tab w:val="left" w:pos="13740"/>
+          <w:tab w:val="left" w:pos="14656"/>
+        </w:tabs>
+        <w:wordWrap w:val="0"/>
+        <w:spacing w:after="0" w:line="240" w:lineRule="atLeast"/>
+        <w:jc w:val="left"/>
+      </w:pPr>
+      <w:r>
+        <w:rPr>
+          <w:noProof/>
+          <w:lang w:eastAsia="es-VE"/>
+        </w:rPr>
+        <w:lastRenderedPageBreak/>
+        <w:drawing>
+          <wp:inline distT="0" distB="0" distL="0" distR="0" wp14:anchorId="79AE4650" wp14:editId="106062C7">
+            <wp:extent cx="5612130" cy="2973161"/>
+            <wp:effectExtent l="0" t="0" r="7620" b="0"/>
+            <wp:docPr id="44" name="Imagen 44" descr="C:\Users\Bernardo\Documents\Machine-Learning-Basico\docs\images\arb9.png"/>
+            <wp:cNvGraphicFramePr>
+              <a:graphicFrameLocks xmlns:a="http://schemas.openxmlformats.org/drawingml/2006/main" noChangeAspect="1"/>
+            </wp:cNvGraphicFramePr>
+            <a:graphic xmlns:a="http://schemas.openxmlformats.org/drawingml/2006/main">
+              <a:graphicData uri="http://schemas.openxmlformats.org/drawingml/2006/picture">
+                <pic:pic xmlns:pic="http://schemas.openxmlformats.org/drawingml/2006/picture">
+                  <pic:nvPicPr>
+                    <pic:cNvPr id="0" name="Picture 3" descr="C:\Users\Bernardo\Documents\Machine-Learning-Basico\docs\images\arb9.png"/>
+                    <pic:cNvPicPr>
+                      <a:picLocks noChangeAspect="1" noChangeArrowheads="1"/>
+                    </pic:cNvPicPr>
+                  </pic:nvPicPr>
+                  <pic:blipFill>
+                    <a:blip r:embed="rId50">
+                      <a:extLst>
+                        <a:ext uri="{28A0092B-C50C-407E-A947-70E740481C1C}">
+                          <a14:useLocalDpi xmlns:a14="http://schemas.microsoft.com/office/drawing/2010/main" val="0"/>
+                        </a:ext>
+                      </a:extLst>
+                    </a:blip>
+                    <a:srcRect/>
+                    <a:stretch>
+                      <a:fillRect/>
+                    </a:stretch>
+                  </pic:blipFill>
+                  <pic:spPr bwMode="auto">
+                    <a:xfrm>
+                      <a:off x="0" y="0"/>
+                      <a:ext cx="5612130" cy="2973161"/>
+                    </a:xfrm>
+                    <a:prstGeom prst="rect">
+                      <a:avLst/>
+                    </a:prstGeom>
+                    <a:noFill/>
+                    <a:ln>
+                      <a:noFill/>
+                    </a:ln>
+                  </pic:spPr>
+                </pic:pic>
+              </a:graphicData>
+            </a:graphic>
+          </wp:inline>
+        </w:drawing>
+      </w:r>
+    </w:p>
+    <w:p>
+      <w:pPr>
+        <w:shd w:val="clear" w:color="auto" w:fill="FFFFFF"/>
+        <w:tabs>
+          <w:tab w:val="left" w:pos="916"/>
+          <w:tab w:val="left" w:pos="1832"/>
+          <w:tab w:val="left" w:pos="2748"/>
+          <w:tab w:val="left" w:pos="3664"/>
+          <w:tab w:val="left" w:pos="4580"/>
+          <w:tab w:val="left" w:pos="5496"/>
+          <w:tab w:val="left" w:pos="6412"/>
+          <w:tab w:val="left" w:pos="7328"/>
+          <w:tab w:val="left" w:pos="8244"/>
+          <w:tab w:val="left" w:pos="9160"/>
+          <w:tab w:val="left" w:pos="10076"/>
+          <w:tab w:val="left" w:pos="10992"/>
+          <w:tab w:val="left" w:pos="11908"/>
+          <w:tab w:val="left" w:pos="12824"/>
+          <w:tab w:val="left" w:pos="13740"/>
+          <w:tab w:val="left" w:pos="14656"/>
+        </w:tabs>
+        <w:wordWrap w:val="0"/>
+        <w:spacing w:after="0" w:line="240" w:lineRule="atLeast"/>
+        <w:jc w:val="left"/>
+      </w:pPr>
+    </w:p>
+    <w:p>
+      <w:pPr>
+        <w:shd w:val="clear" w:color="auto" w:fill="FFFFFF"/>
+        <w:tabs>
+          <w:tab w:val="left" w:pos="916"/>
+          <w:tab w:val="left" w:pos="1832"/>
+          <w:tab w:val="left" w:pos="2748"/>
+          <w:tab w:val="left" w:pos="3664"/>
+          <w:tab w:val="left" w:pos="4580"/>
+          <w:tab w:val="left" w:pos="5496"/>
+          <w:tab w:val="left" w:pos="6412"/>
+          <w:tab w:val="left" w:pos="7328"/>
+          <w:tab w:val="left" w:pos="8244"/>
+          <w:tab w:val="left" w:pos="9160"/>
+          <w:tab w:val="left" w:pos="10076"/>
+          <w:tab w:val="left" w:pos="10992"/>
+          <w:tab w:val="left" w:pos="11908"/>
+          <w:tab w:val="left" w:pos="12824"/>
+          <w:tab w:val="left" w:pos="13740"/>
+          <w:tab w:val="left" w:pos="14656"/>
+        </w:tabs>
+        <w:wordWrap w:val="0"/>
+        <w:spacing w:after="0" w:line="200" w:lineRule="atLeast"/>
+        <w:jc w:val="left"/>
+        <w:rPr>
+          <w:rFonts w:ascii="Lucida Console" w:eastAsia="Times New Roman" w:hAnsi="Lucida Console" w:cs="Courier New"/>
+          <w:color w:val="0070C0"/>
+          <w:sz w:val="20"/>
+          <w:szCs w:val="20"/>
+          <w:bdr w:val="none" w:sz="0" w:space="0" w:color="auto" w:frame="1"/>
+          <w:lang w:eastAsia="es-VE"/>
+        </w:rPr>
+      </w:pPr>
+      <w:proofErr w:type="spellStart"/>
+      <w:r>
+        <w:rPr>
+          <w:rFonts w:ascii="Lucida Console" w:eastAsia="Times New Roman" w:hAnsi="Lucida Console" w:cs="Courier New"/>
+          <w:color w:val="0070C0"/>
+          <w:sz w:val="20"/>
+          <w:szCs w:val="20"/>
+          <w:bdr w:val="none" w:sz="0" w:space="0" w:color="auto" w:frame="1"/>
+          <w:lang w:eastAsia="es-VE"/>
+        </w:rPr>
+        <w:t>Call</w:t>
+      </w:r>
+      <w:proofErr w:type="spellEnd"/>
+      <w:r>
+        <w:rPr>
+          <w:rFonts w:ascii="Lucida Console" w:eastAsia="Times New Roman" w:hAnsi="Lucida Console" w:cs="Courier New"/>
+          <w:color w:val="0070C0"/>
+          <w:sz w:val="20"/>
+          <w:szCs w:val="20"/>
+          <w:bdr w:val="none" w:sz="0" w:space="0" w:color="auto" w:frame="1"/>
+          <w:lang w:eastAsia="es-VE"/>
+        </w:rPr>
+        <w:t>:</w:t>
+      </w:r>
+    </w:p>
+    <w:p>
+      <w:pPr>
+        <w:shd w:val="clear" w:color="auto" w:fill="FFFFFF"/>
+        <w:tabs>
+          <w:tab w:val="left" w:pos="916"/>
+          <w:tab w:val="left" w:pos="1832"/>
+          <w:tab w:val="left" w:pos="2748"/>
+          <w:tab w:val="left" w:pos="3664"/>
+          <w:tab w:val="left" w:pos="4580"/>
+          <w:tab w:val="left" w:pos="5496"/>
+          <w:tab w:val="left" w:pos="6412"/>
+          <w:tab w:val="left" w:pos="7328"/>
+          <w:tab w:val="left" w:pos="8244"/>
+          <w:tab w:val="left" w:pos="9160"/>
+          <w:tab w:val="left" w:pos="10076"/>
+          <w:tab w:val="left" w:pos="10992"/>
+          <w:tab w:val="left" w:pos="11908"/>
+          <w:tab w:val="left" w:pos="12824"/>
+          <w:tab w:val="left" w:pos="13740"/>
+          <w:tab w:val="left" w:pos="14656"/>
+        </w:tabs>
+        <w:wordWrap w:val="0"/>
+        <w:spacing w:after="0" w:line="200" w:lineRule="atLeast"/>
+        <w:jc w:val="left"/>
+        <w:rPr>
+          <w:rFonts w:ascii="Lucida Console" w:eastAsia="Times New Roman" w:hAnsi="Lucida Console" w:cs="Courier New"/>
+          <w:color w:val="0070C0"/>
+          <w:sz w:val="20"/>
+          <w:szCs w:val="20"/>
+          <w:bdr w:val="none" w:sz="0" w:space="0" w:color="auto" w:frame="1"/>
+          <w:lang w:eastAsia="es-VE"/>
+        </w:rPr>
+      </w:pPr>
+      <w:r>
+        <w:rPr>
+          <w:rFonts w:ascii="Lucida Console" w:eastAsia="Times New Roman" w:hAnsi="Lucida Console" w:cs="Courier New"/>
+          <w:color w:val="0070C0"/>
+          <w:sz w:val="20"/>
+          <w:szCs w:val="20"/>
+          <w:bdr w:val="none" w:sz="0" w:space="0" w:color="auto" w:frame="1"/>
+          <w:lang w:eastAsia="es-VE"/>
+        </w:rPr>
+        <w:t xml:space="preserve"> </w:t>
+      </w:r>
+      <w:proofErr w:type="spellStart"/>
+      <w:proofErr w:type="gramStart"/>
+      <w:r>
+        <w:rPr>
+          <w:rFonts w:ascii="Lucida Console" w:eastAsia="Times New Roman" w:hAnsi="Lucida Console" w:cs="Courier New"/>
+          <w:color w:val="0070C0"/>
+          <w:sz w:val="20"/>
+          <w:szCs w:val="20"/>
+          <w:bdr w:val="none" w:sz="0" w:space="0" w:color="auto" w:frame="1"/>
+          <w:lang w:eastAsia="es-VE"/>
+        </w:rPr>
+        <w:t>randomForest</w:t>
+      </w:r>
+      <w:proofErr w:type="spellEnd"/>
+      <w:r>
+        <w:rPr>
+          <w:rFonts w:ascii="Lucida Console" w:eastAsia="Times New Roman" w:hAnsi="Lucida Console" w:cs="Courier New"/>
+          <w:color w:val="0070C0"/>
+          <w:sz w:val="20"/>
+          <w:szCs w:val="20"/>
+          <w:bdr w:val="none" w:sz="0" w:space="0" w:color="auto" w:frame="1"/>
+          <w:lang w:eastAsia="es-VE"/>
+        </w:rPr>
+        <w:t>(</w:t>
+      </w:r>
+      <w:proofErr w:type="gramEnd"/>
+      <w:r>
+        <w:rPr>
+          <w:rFonts w:ascii="Lucida Console" w:eastAsia="Times New Roman" w:hAnsi="Lucida Console" w:cs="Courier New"/>
+          <w:color w:val="0070C0"/>
+          <w:sz w:val="20"/>
+          <w:szCs w:val="20"/>
+          <w:bdr w:val="none" w:sz="0" w:space="0" w:color="auto" w:frame="1"/>
+          <w:lang w:eastAsia="es-VE"/>
+        </w:rPr>
+        <w:t xml:space="preserve">x = </w:t>
+      </w:r>
+      <w:proofErr w:type="spellStart"/>
+      <w:r>
+        <w:rPr>
+          <w:rFonts w:ascii="Lucida Console" w:eastAsia="Times New Roman" w:hAnsi="Lucida Console" w:cs="Courier New"/>
+          <w:color w:val="0070C0"/>
+          <w:sz w:val="20"/>
+          <w:szCs w:val="20"/>
+          <w:bdr w:val="none" w:sz="0" w:space="0" w:color="auto" w:frame="1"/>
+          <w:lang w:eastAsia="es-VE"/>
+        </w:rPr>
+        <w:t>Predictoras</w:t>
+      </w:r>
+      <w:proofErr w:type="spellEnd"/>
+      <w:r>
+        <w:rPr>
+          <w:rFonts w:ascii="Lucida Console" w:eastAsia="Times New Roman" w:hAnsi="Lucida Console" w:cs="Courier New"/>
+          <w:color w:val="0070C0"/>
+          <w:sz w:val="20"/>
+          <w:szCs w:val="20"/>
+          <w:bdr w:val="none" w:sz="0" w:space="0" w:color="auto" w:frame="1"/>
+          <w:lang w:eastAsia="es-VE"/>
+        </w:rPr>
+        <w:t xml:space="preserve">, y = Objetivo, </w:t>
+      </w:r>
+      <w:proofErr w:type="spellStart"/>
+      <w:r>
+        <w:rPr>
+          <w:rFonts w:ascii="Lucida Console" w:eastAsia="Times New Roman" w:hAnsi="Lucida Console" w:cs="Courier New"/>
+          <w:color w:val="0070C0"/>
+          <w:sz w:val="20"/>
+          <w:szCs w:val="20"/>
+          <w:bdr w:val="none" w:sz="0" w:space="0" w:color="auto" w:frame="1"/>
+          <w:lang w:eastAsia="es-VE"/>
+        </w:rPr>
+        <w:t>ntree</w:t>
+      </w:r>
+      <w:proofErr w:type="spellEnd"/>
+      <w:r>
+        <w:rPr>
+          <w:rFonts w:ascii="Lucida Console" w:eastAsia="Times New Roman" w:hAnsi="Lucida Console" w:cs="Courier New"/>
+          <w:color w:val="0070C0"/>
+          <w:sz w:val="20"/>
+          <w:szCs w:val="20"/>
+          <w:bdr w:val="none" w:sz="0" w:space="0" w:color="auto" w:frame="1"/>
+          <w:lang w:eastAsia="es-VE"/>
+        </w:rPr>
+        <w:t xml:space="preserve"> = 500) </w:t>
+      </w:r>
+    </w:p>
+    <w:p>
+      <w:pPr>
+        <w:shd w:val="clear" w:color="auto" w:fill="FFFFFF"/>
+        <w:tabs>
+          <w:tab w:val="left" w:pos="916"/>
+          <w:tab w:val="left" w:pos="1832"/>
+          <w:tab w:val="left" w:pos="2748"/>
+          <w:tab w:val="left" w:pos="3664"/>
+          <w:tab w:val="left" w:pos="4580"/>
+          <w:tab w:val="left" w:pos="5496"/>
+          <w:tab w:val="left" w:pos="6412"/>
+          <w:tab w:val="left" w:pos="7328"/>
+          <w:tab w:val="left" w:pos="8244"/>
+          <w:tab w:val="left" w:pos="9160"/>
+          <w:tab w:val="left" w:pos="10076"/>
+          <w:tab w:val="left" w:pos="10992"/>
+          <w:tab w:val="left" w:pos="11908"/>
+          <w:tab w:val="left" w:pos="12824"/>
+          <w:tab w:val="left" w:pos="13740"/>
+          <w:tab w:val="left" w:pos="14656"/>
+        </w:tabs>
+        <w:wordWrap w:val="0"/>
+        <w:spacing w:after="0" w:line="200" w:lineRule="atLeast"/>
+        <w:jc w:val="left"/>
+        <w:rPr>
+          <w:rFonts w:ascii="Lucida Console" w:eastAsia="Times New Roman" w:hAnsi="Lucida Console" w:cs="Courier New"/>
+          <w:color w:val="0070C0"/>
+          <w:sz w:val="20"/>
+          <w:szCs w:val="20"/>
+          <w:bdr w:val="none" w:sz="0" w:space="0" w:color="auto" w:frame="1"/>
+          <w:lang w:eastAsia="es-VE"/>
+        </w:rPr>
+      </w:pPr>
+      <w:r>
+        <w:rPr>
+          <w:rFonts w:ascii="Lucida Console" w:eastAsia="Times New Roman" w:hAnsi="Lucida Console" w:cs="Courier New"/>
+          <w:color w:val="0070C0"/>
+          <w:sz w:val="20"/>
+          <w:szCs w:val="20"/>
+          <w:bdr w:val="none" w:sz="0" w:space="0" w:color="auto" w:frame="1"/>
+          <w:lang w:eastAsia="es-VE"/>
+        </w:rPr>
+        <w:t xml:space="preserve">               </w:t>
+      </w:r>
+      <w:proofErr w:type="spellStart"/>
+      <w:r>
+        <w:rPr>
+          <w:rFonts w:ascii="Lucida Console" w:eastAsia="Times New Roman" w:hAnsi="Lucida Console" w:cs="Courier New"/>
+          <w:color w:val="0070C0"/>
+          <w:sz w:val="20"/>
+          <w:szCs w:val="20"/>
+          <w:bdr w:val="none" w:sz="0" w:space="0" w:color="auto" w:frame="1"/>
+          <w:lang w:eastAsia="es-VE"/>
+        </w:rPr>
+        <w:t>Type</w:t>
+      </w:r>
+      <w:proofErr w:type="spellEnd"/>
+      <w:r>
+        <w:rPr>
+          <w:rFonts w:ascii="Lucida Console" w:eastAsia="Times New Roman" w:hAnsi="Lucida Console" w:cs="Courier New"/>
+          <w:color w:val="0070C0"/>
+          <w:sz w:val="20"/>
+          <w:szCs w:val="20"/>
+          <w:bdr w:val="none" w:sz="0" w:space="0" w:color="auto" w:frame="1"/>
+          <w:lang w:eastAsia="es-VE"/>
+        </w:rPr>
+        <w:t xml:space="preserve"> of </w:t>
+      </w:r>
+      <w:proofErr w:type="spellStart"/>
+      <w:r>
+        <w:rPr>
+          <w:rFonts w:ascii="Lucida Console" w:eastAsia="Times New Roman" w:hAnsi="Lucida Console" w:cs="Courier New"/>
+          <w:color w:val="0070C0"/>
+          <w:sz w:val="20"/>
+          <w:szCs w:val="20"/>
+          <w:bdr w:val="none" w:sz="0" w:space="0" w:color="auto" w:frame="1"/>
+          <w:lang w:eastAsia="es-VE"/>
+        </w:rPr>
+        <w:t>random</w:t>
+      </w:r>
+      <w:proofErr w:type="spellEnd"/>
+      <w:r>
+        <w:rPr>
+          <w:rFonts w:ascii="Lucida Console" w:eastAsia="Times New Roman" w:hAnsi="Lucida Console" w:cs="Courier New"/>
+          <w:color w:val="0070C0"/>
+          <w:sz w:val="20"/>
+          <w:szCs w:val="20"/>
+          <w:bdr w:val="none" w:sz="0" w:space="0" w:color="auto" w:frame="1"/>
+          <w:lang w:eastAsia="es-VE"/>
+        </w:rPr>
+        <w:t xml:space="preserve"> </w:t>
+      </w:r>
+      <w:proofErr w:type="spellStart"/>
+      <w:r>
+        <w:rPr>
+          <w:rFonts w:ascii="Lucida Console" w:eastAsia="Times New Roman" w:hAnsi="Lucida Console" w:cs="Courier New"/>
+          <w:color w:val="0070C0"/>
+          <w:sz w:val="20"/>
+          <w:szCs w:val="20"/>
+          <w:bdr w:val="none" w:sz="0" w:space="0" w:color="auto" w:frame="1"/>
+          <w:lang w:eastAsia="es-VE"/>
+        </w:rPr>
+        <w:t>forest</w:t>
+      </w:r>
+      <w:proofErr w:type="spellEnd"/>
+      <w:r>
+        <w:rPr>
+          <w:rFonts w:ascii="Lucida Console" w:eastAsia="Times New Roman" w:hAnsi="Lucida Console" w:cs="Courier New"/>
+          <w:color w:val="0070C0"/>
+          <w:sz w:val="20"/>
+          <w:szCs w:val="20"/>
+          <w:bdr w:val="none" w:sz="0" w:space="0" w:color="auto" w:frame="1"/>
+          <w:lang w:eastAsia="es-VE"/>
+        </w:rPr>
+        <w:t xml:space="preserve">: </w:t>
+      </w:r>
+      <w:proofErr w:type="spellStart"/>
+      <w:r>
+        <w:rPr>
+          <w:rFonts w:ascii="Lucida Console" w:eastAsia="Times New Roman" w:hAnsi="Lucida Console" w:cs="Courier New"/>
+          <w:color w:val="0070C0"/>
+          <w:sz w:val="20"/>
+          <w:szCs w:val="20"/>
+          <w:bdr w:val="none" w:sz="0" w:space="0" w:color="auto" w:frame="1"/>
+          <w:lang w:eastAsia="es-VE"/>
+        </w:rPr>
+        <w:t>classification</w:t>
+      </w:r>
+      <w:proofErr w:type="spellEnd"/>
+    </w:p>
+    <w:p>
+      <w:pPr>
+        <w:shd w:val="clear" w:color="auto" w:fill="FFFFFF"/>
+        <w:tabs>
+          <w:tab w:val="left" w:pos="916"/>
+          <w:tab w:val="left" w:pos="1832"/>
+          <w:tab w:val="left" w:pos="2748"/>
+          <w:tab w:val="left" w:pos="3664"/>
+          <w:tab w:val="left" w:pos="4580"/>
+          <w:tab w:val="left" w:pos="5496"/>
+          <w:tab w:val="left" w:pos="6412"/>
+          <w:tab w:val="left" w:pos="7328"/>
+          <w:tab w:val="left" w:pos="8244"/>
+          <w:tab w:val="left" w:pos="9160"/>
+          <w:tab w:val="left" w:pos="10076"/>
+          <w:tab w:val="left" w:pos="10992"/>
+          <w:tab w:val="left" w:pos="11908"/>
+          <w:tab w:val="left" w:pos="12824"/>
+          <w:tab w:val="left" w:pos="13740"/>
+          <w:tab w:val="left" w:pos="14656"/>
+        </w:tabs>
+        <w:wordWrap w:val="0"/>
+        <w:spacing w:after="0" w:line="200" w:lineRule="atLeast"/>
+        <w:jc w:val="left"/>
+        <w:rPr>
+          <w:rFonts w:ascii="Lucida Console" w:eastAsia="Times New Roman" w:hAnsi="Lucida Console" w:cs="Courier New"/>
+          <w:color w:val="0070C0"/>
+          <w:sz w:val="20"/>
+          <w:szCs w:val="20"/>
+          <w:bdr w:val="none" w:sz="0" w:space="0" w:color="auto" w:frame="1"/>
+          <w:lang w:eastAsia="es-VE"/>
+        </w:rPr>
+      </w:pPr>
+      <w:r>
+        <w:rPr>
+          <w:rFonts w:ascii="Lucida Console" w:eastAsia="Times New Roman" w:hAnsi="Lucida Console" w:cs="Courier New"/>
+          <w:color w:val="0070C0"/>
+          <w:sz w:val="20"/>
+          <w:szCs w:val="20"/>
+          <w:bdr w:val="none" w:sz="0" w:space="0" w:color="auto" w:frame="1"/>
+          <w:lang w:eastAsia="es-VE"/>
+        </w:rPr>
+        <w:t xml:space="preserve">                     </w:t>
+      </w:r>
+      <w:proofErr w:type="spellStart"/>
+      <w:r>
+        <w:rPr>
+          <w:rFonts w:ascii="Lucida Console" w:eastAsia="Times New Roman" w:hAnsi="Lucida Console" w:cs="Courier New"/>
+          <w:color w:val="0070C0"/>
+          <w:sz w:val="20"/>
+          <w:szCs w:val="20"/>
+          <w:bdr w:val="none" w:sz="0" w:space="0" w:color="auto" w:frame="1"/>
+          <w:lang w:eastAsia="es-VE"/>
+        </w:rPr>
+        <w:t>Number</w:t>
+      </w:r>
+      <w:proofErr w:type="spellEnd"/>
+      <w:r>
+        <w:rPr>
+          <w:rFonts w:ascii="Lucida Console" w:eastAsia="Times New Roman" w:hAnsi="Lucida Console" w:cs="Courier New"/>
+          <w:color w:val="0070C0"/>
+          <w:sz w:val="20"/>
+          <w:szCs w:val="20"/>
+          <w:bdr w:val="none" w:sz="0" w:space="0" w:color="auto" w:frame="1"/>
+          <w:lang w:eastAsia="es-VE"/>
+        </w:rPr>
+        <w:t xml:space="preserve"> of </w:t>
+      </w:r>
+      <w:proofErr w:type="spellStart"/>
+      <w:r>
+        <w:rPr>
+          <w:rFonts w:ascii="Lucida Console" w:eastAsia="Times New Roman" w:hAnsi="Lucida Console" w:cs="Courier New"/>
+          <w:color w:val="0070C0"/>
+          <w:sz w:val="20"/>
+          <w:szCs w:val="20"/>
+          <w:bdr w:val="none" w:sz="0" w:space="0" w:color="auto" w:frame="1"/>
+          <w:lang w:eastAsia="es-VE"/>
+        </w:rPr>
+        <w:t>trees</w:t>
+      </w:r>
+      <w:proofErr w:type="spellEnd"/>
+      <w:r>
+        <w:rPr>
+          <w:rFonts w:ascii="Lucida Console" w:eastAsia="Times New Roman" w:hAnsi="Lucida Console" w:cs="Courier New"/>
+          <w:color w:val="0070C0"/>
+          <w:sz w:val="20"/>
+          <w:szCs w:val="20"/>
+          <w:bdr w:val="none" w:sz="0" w:space="0" w:color="auto" w:frame="1"/>
+          <w:lang w:eastAsia="es-VE"/>
+        </w:rPr>
+        <w:t>: 500</w:t>
+      </w:r>
+    </w:p>
+    <w:p>
+      <w:pPr>
+        <w:shd w:val="clear" w:color="auto" w:fill="FFFFFF"/>
+        <w:tabs>
+          <w:tab w:val="left" w:pos="916"/>
+          <w:tab w:val="left" w:pos="1832"/>
+          <w:tab w:val="left" w:pos="2748"/>
+          <w:tab w:val="left" w:pos="3664"/>
+          <w:tab w:val="left" w:pos="4580"/>
+          <w:tab w:val="left" w:pos="5496"/>
+          <w:tab w:val="left" w:pos="6412"/>
+          <w:tab w:val="left" w:pos="7328"/>
+          <w:tab w:val="left" w:pos="8244"/>
+          <w:tab w:val="left" w:pos="9160"/>
+          <w:tab w:val="left" w:pos="10076"/>
+          <w:tab w:val="left" w:pos="10992"/>
+          <w:tab w:val="left" w:pos="11908"/>
+          <w:tab w:val="left" w:pos="12824"/>
+          <w:tab w:val="left" w:pos="13740"/>
+          <w:tab w:val="left" w:pos="14656"/>
+        </w:tabs>
+        <w:wordWrap w:val="0"/>
+        <w:spacing w:after="0" w:line="200" w:lineRule="atLeast"/>
+        <w:jc w:val="left"/>
+        <w:rPr>
+          <w:rFonts w:ascii="Lucida Console" w:eastAsia="Times New Roman" w:hAnsi="Lucida Console" w:cs="Courier New"/>
+          <w:color w:val="0070C0"/>
+          <w:sz w:val="20"/>
+          <w:szCs w:val="20"/>
+          <w:bdr w:val="none" w:sz="0" w:space="0" w:color="auto" w:frame="1"/>
+          <w:lang w:eastAsia="es-VE"/>
+        </w:rPr>
+      </w:pPr>
+      <w:r>
+        <w:rPr>
+          <w:rFonts w:ascii="Lucida Console" w:eastAsia="Times New Roman" w:hAnsi="Lucida Console" w:cs="Courier New"/>
+          <w:color w:val="0070C0"/>
+          <w:sz w:val="20"/>
+          <w:szCs w:val="20"/>
+          <w:bdr w:val="none" w:sz="0" w:space="0" w:color="auto" w:frame="1"/>
+          <w:lang w:eastAsia="es-VE"/>
+        </w:rPr>
+        <w:t xml:space="preserve">No. of variables </w:t>
+      </w:r>
+      <w:proofErr w:type="spellStart"/>
+      <w:r>
+        <w:rPr>
+          <w:rFonts w:ascii="Lucida Console" w:eastAsia="Times New Roman" w:hAnsi="Lucida Console" w:cs="Courier New"/>
+          <w:color w:val="0070C0"/>
+          <w:sz w:val="20"/>
+          <w:szCs w:val="20"/>
+          <w:bdr w:val="none" w:sz="0" w:space="0" w:color="auto" w:frame="1"/>
+          <w:lang w:eastAsia="es-VE"/>
+        </w:rPr>
+        <w:t>tried</w:t>
+      </w:r>
+      <w:proofErr w:type="spellEnd"/>
+      <w:r>
+        <w:rPr>
+          <w:rFonts w:ascii="Lucida Console" w:eastAsia="Times New Roman" w:hAnsi="Lucida Console" w:cs="Courier New"/>
+          <w:color w:val="0070C0"/>
+          <w:sz w:val="20"/>
+          <w:szCs w:val="20"/>
+          <w:bdr w:val="none" w:sz="0" w:space="0" w:color="auto" w:frame="1"/>
+          <w:lang w:eastAsia="es-VE"/>
+        </w:rPr>
+        <w:t xml:space="preserve"> at </w:t>
+      </w:r>
+      <w:proofErr w:type="spellStart"/>
+      <w:r>
+        <w:rPr>
+          <w:rFonts w:ascii="Lucida Console" w:eastAsia="Times New Roman" w:hAnsi="Lucida Console" w:cs="Courier New"/>
+          <w:color w:val="0070C0"/>
+          <w:sz w:val="20"/>
+          <w:szCs w:val="20"/>
+          <w:bdr w:val="none" w:sz="0" w:space="0" w:color="auto" w:frame="1"/>
+          <w:lang w:eastAsia="es-VE"/>
+        </w:rPr>
+        <w:t>each</w:t>
+      </w:r>
+      <w:proofErr w:type="spellEnd"/>
+      <w:r>
+        <w:rPr>
+          <w:rFonts w:ascii="Lucida Console" w:eastAsia="Times New Roman" w:hAnsi="Lucida Console" w:cs="Courier New"/>
+          <w:color w:val="0070C0"/>
+          <w:sz w:val="20"/>
+          <w:szCs w:val="20"/>
+          <w:bdr w:val="none" w:sz="0" w:space="0" w:color="auto" w:frame="1"/>
+          <w:lang w:eastAsia="es-VE"/>
+        </w:rPr>
+        <w:t xml:space="preserve"> </w:t>
+      </w:r>
+      <w:proofErr w:type="spellStart"/>
+      <w:r>
+        <w:rPr>
+          <w:rFonts w:ascii="Lucida Console" w:eastAsia="Times New Roman" w:hAnsi="Lucida Console" w:cs="Courier New"/>
+          <w:color w:val="0070C0"/>
+          <w:sz w:val="20"/>
+          <w:szCs w:val="20"/>
+          <w:bdr w:val="none" w:sz="0" w:space="0" w:color="auto" w:frame="1"/>
+          <w:lang w:eastAsia="es-VE"/>
+        </w:rPr>
+        <w:t>split</w:t>
+      </w:r>
+      <w:proofErr w:type="spellEnd"/>
+      <w:r>
+        <w:rPr>
+          <w:rFonts w:ascii="Lucida Console" w:eastAsia="Times New Roman" w:hAnsi="Lucida Console" w:cs="Courier New"/>
+          <w:color w:val="0070C0"/>
+          <w:sz w:val="20"/>
+          <w:szCs w:val="20"/>
+          <w:bdr w:val="none" w:sz="0" w:space="0" w:color="auto" w:frame="1"/>
+          <w:lang w:eastAsia="es-VE"/>
+        </w:rPr>
+        <w:t>: 2</w:t>
+      </w:r>
+    </w:p>
+    <w:p>
+      <w:pPr>
+        <w:shd w:val="clear" w:color="auto" w:fill="FFFFFF"/>
+        <w:tabs>
+          <w:tab w:val="left" w:pos="916"/>
+          <w:tab w:val="left" w:pos="1832"/>
+          <w:tab w:val="left" w:pos="2748"/>
+          <w:tab w:val="left" w:pos="3664"/>
+          <w:tab w:val="left" w:pos="4580"/>
+          <w:tab w:val="left" w:pos="5496"/>
+          <w:tab w:val="left" w:pos="6412"/>
+          <w:tab w:val="left" w:pos="7328"/>
+          <w:tab w:val="left" w:pos="8244"/>
+          <w:tab w:val="left" w:pos="9160"/>
+          <w:tab w:val="left" w:pos="10076"/>
+          <w:tab w:val="left" w:pos="10992"/>
+          <w:tab w:val="left" w:pos="11908"/>
+          <w:tab w:val="left" w:pos="12824"/>
+          <w:tab w:val="left" w:pos="13740"/>
+          <w:tab w:val="left" w:pos="14656"/>
+        </w:tabs>
+        <w:wordWrap w:val="0"/>
+        <w:spacing w:after="0" w:line="200" w:lineRule="atLeast"/>
+        <w:jc w:val="left"/>
+        <w:rPr>
+          <w:rFonts w:ascii="Lucida Console" w:eastAsia="Times New Roman" w:hAnsi="Lucida Console" w:cs="Courier New"/>
+          <w:color w:val="0070C0"/>
+          <w:sz w:val="20"/>
+          <w:szCs w:val="20"/>
+          <w:bdr w:val="none" w:sz="0" w:space="0" w:color="auto" w:frame="1"/>
+          <w:lang w:eastAsia="es-VE"/>
+        </w:rPr>
+      </w:pPr>
+    </w:p>
+    <w:p>
+      <w:pPr>
+        <w:shd w:val="clear" w:color="auto" w:fill="FFFFFF"/>
+        <w:tabs>
+          <w:tab w:val="left" w:pos="916"/>
+          <w:tab w:val="left" w:pos="1832"/>
+          <w:tab w:val="left" w:pos="2748"/>
+          <w:tab w:val="left" w:pos="3664"/>
+          <w:tab w:val="left" w:pos="4580"/>
+          <w:tab w:val="left" w:pos="5496"/>
+          <w:tab w:val="left" w:pos="6412"/>
+          <w:tab w:val="left" w:pos="7328"/>
+          <w:tab w:val="left" w:pos="8244"/>
+          <w:tab w:val="left" w:pos="9160"/>
+          <w:tab w:val="left" w:pos="10076"/>
+          <w:tab w:val="left" w:pos="10992"/>
+          <w:tab w:val="left" w:pos="11908"/>
+          <w:tab w:val="left" w:pos="12824"/>
+          <w:tab w:val="left" w:pos="13740"/>
+          <w:tab w:val="left" w:pos="14656"/>
+        </w:tabs>
+        <w:wordWrap w:val="0"/>
+        <w:spacing w:after="0" w:line="200" w:lineRule="atLeast"/>
+        <w:jc w:val="left"/>
+        <w:rPr>
+          <w:rFonts w:ascii="Lucida Console" w:eastAsia="Times New Roman" w:hAnsi="Lucida Console" w:cs="Courier New"/>
+          <w:color w:val="0070C0"/>
+          <w:sz w:val="20"/>
+          <w:szCs w:val="20"/>
+          <w:bdr w:val="none" w:sz="0" w:space="0" w:color="auto" w:frame="1"/>
+          <w:lang w:eastAsia="es-VE"/>
+        </w:rPr>
+      </w:pPr>
+      <w:r>
+        <w:rPr>
+          <w:rFonts w:ascii="Lucida Console" w:eastAsia="Times New Roman" w:hAnsi="Lucida Console" w:cs="Courier New"/>
+          <w:color w:val="0070C0"/>
+          <w:sz w:val="20"/>
+          <w:szCs w:val="20"/>
+          <w:bdr w:val="none" w:sz="0" w:space="0" w:color="auto" w:frame="1"/>
+          <w:lang w:eastAsia="es-VE"/>
+        </w:rPr>
+        <w:t xml:space="preserve">        OOB </w:t>
+      </w:r>
+      <w:proofErr w:type="spellStart"/>
+      <w:r>
+        <w:rPr>
+          <w:rFonts w:ascii="Lucida Console" w:eastAsia="Times New Roman" w:hAnsi="Lucida Console" w:cs="Courier New"/>
+          <w:color w:val="0070C0"/>
+          <w:sz w:val="20"/>
+          <w:szCs w:val="20"/>
+          <w:bdr w:val="none" w:sz="0" w:space="0" w:color="auto" w:frame="1"/>
+          <w:lang w:eastAsia="es-VE"/>
+        </w:rPr>
+        <w:t>estimate</w:t>
+      </w:r>
+      <w:proofErr w:type="spellEnd"/>
+      <w:r>
+        <w:rPr>
+          <w:rFonts w:ascii="Lucida Console" w:eastAsia="Times New Roman" w:hAnsi="Lucida Console" w:cs="Courier New"/>
+          <w:color w:val="0070C0"/>
+          <w:sz w:val="20"/>
+          <w:szCs w:val="20"/>
+          <w:bdr w:val="none" w:sz="0" w:space="0" w:color="auto" w:frame="1"/>
+          <w:lang w:eastAsia="es-VE"/>
+        </w:rPr>
+        <w:t xml:space="preserve"> of  error </w:t>
+      </w:r>
+      <w:proofErr w:type="spellStart"/>
+      <w:r>
+        <w:rPr>
+          <w:rFonts w:ascii="Lucida Console" w:eastAsia="Times New Roman" w:hAnsi="Lucida Console" w:cs="Courier New"/>
+          <w:color w:val="0070C0"/>
+          <w:sz w:val="20"/>
+          <w:szCs w:val="20"/>
+          <w:bdr w:val="none" w:sz="0" w:space="0" w:color="auto" w:frame="1"/>
+          <w:lang w:eastAsia="es-VE"/>
+        </w:rPr>
+        <w:t>rate</w:t>
+      </w:r>
+      <w:proofErr w:type="spellEnd"/>
+      <w:r>
+        <w:rPr>
+          <w:rFonts w:ascii="Lucida Console" w:eastAsia="Times New Roman" w:hAnsi="Lucida Console" w:cs="Courier New"/>
+          <w:color w:val="0070C0"/>
+          <w:sz w:val="20"/>
+          <w:szCs w:val="20"/>
+          <w:bdr w:val="none" w:sz="0" w:space="0" w:color="auto" w:frame="1"/>
+          <w:lang w:eastAsia="es-VE"/>
+        </w:rPr>
+        <w:t>: 4%</w:t>
+      </w:r>
+    </w:p>
+    <w:p>
+      <w:pPr>
+        <w:shd w:val="clear" w:color="auto" w:fill="FFFFFF"/>
+        <w:tabs>
+          <w:tab w:val="left" w:pos="916"/>
+          <w:tab w:val="left" w:pos="1832"/>
+          <w:tab w:val="left" w:pos="2748"/>
+          <w:tab w:val="left" w:pos="3664"/>
+          <w:tab w:val="left" w:pos="4580"/>
+          <w:tab w:val="left" w:pos="5496"/>
+          <w:tab w:val="left" w:pos="6412"/>
+          <w:tab w:val="left" w:pos="7328"/>
+          <w:tab w:val="left" w:pos="8244"/>
+          <w:tab w:val="left" w:pos="9160"/>
+          <w:tab w:val="left" w:pos="10076"/>
+          <w:tab w:val="left" w:pos="10992"/>
+          <w:tab w:val="left" w:pos="11908"/>
+          <w:tab w:val="left" w:pos="12824"/>
+          <w:tab w:val="left" w:pos="13740"/>
+          <w:tab w:val="left" w:pos="14656"/>
+        </w:tabs>
+        <w:wordWrap w:val="0"/>
+        <w:spacing w:after="0" w:line="200" w:lineRule="atLeast"/>
+        <w:jc w:val="left"/>
+        <w:rPr>
+          <w:rFonts w:ascii="Lucida Console" w:eastAsia="Times New Roman" w:hAnsi="Lucida Console" w:cs="Courier New"/>
+          <w:color w:val="0070C0"/>
+          <w:sz w:val="20"/>
+          <w:szCs w:val="20"/>
+          <w:bdr w:val="none" w:sz="0" w:space="0" w:color="auto" w:frame="1"/>
+          <w:lang w:eastAsia="es-VE"/>
+        </w:rPr>
+      </w:pPr>
+      <w:proofErr w:type="spellStart"/>
+      <w:r>
+        <w:rPr>
+          <w:rFonts w:ascii="Lucida Console" w:eastAsia="Times New Roman" w:hAnsi="Lucida Console" w:cs="Courier New"/>
+          <w:color w:val="0070C0"/>
+          <w:sz w:val="20"/>
+          <w:szCs w:val="20"/>
+          <w:bdr w:val="none" w:sz="0" w:space="0" w:color="auto" w:frame="1"/>
+          <w:lang w:eastAsia="es-VE"/>
+        </w:rPr>
+        <w:t>Confusion</w:t>
+      </w:r>
+      <w:proofErr w:type="spellEnd"/>
+      <w:r>
+        <w:rPr>
+          <w:rFonts w:ascii="Lucida Console" w:eastAsia="Times New Roman" w:hAnsi="Lucida Console" w:cs="Courier New"/>
+          <w:color w:val="0070C0"/>
+          <w:sz w:val="20"/>
+          <w:szCs w:val="20"/>
+          <w:bdr w:val="none" w:sz="0" w:space="0" w:color="auto" w:frame="1"/>
+          <w:lang w:eastAsia="es-VE"/>
+        </w:rPr>
+        <w:t xml:space="preserve"> </w:t>
+      </w:r>
+      <w:proofErr w:type="spellStart"/>
+      <w:r>
+        <w:rPr>
+          <w:rFonts w:ascii="Lucida Console" w:eastAsia="Times New Roman" w:hAnsi="Lucida Console" w:cs="Courier New"/>
+          <w:color w:val="0070C0"/>
+          <w:sz w:val="20"/>
+          <w:szCs w:val="20"/>
+          <w:bdr w:val="none" w:sz="0" w:space="0" w:color="auto" w:frame="1"/>
+          <w:lang w:eastAsia="es-VE"/>
+        </w:rPr>
+        <w:t>matrix</w:t>
+      </w:r>
+      <w:proofErr w:type="spellEnd"/>
+      <w:r>
+        <w:rPr>
+          <w:rFonts w:ascii="Lucida Console" w:eastAsia="Times New Roman" w:hAnsi="Lucida Console" w:cs="Courier New"/>
+          <w:color w:val="0070C0"/>
+          <w:sz w:val="20"/>
+          <w:szCs w:val="20"/>
+          <w:bdr w:val="none" w:sz="0" w:space="0" w:color="auto" w:frame="1"/>
+          <w:lang w:eastAsia="es-VE"/>
+        </w:rPr>
+        <w:t>:</w:t>
+      </w:r>
+    </w:p>
+    <w:p>
+      <w:pPr>
+        <w:shd w:val="clear" w:color="auto" w:fill="FFFFFF"/>
+        <w:tabs>
+          <w:tab w:val="left" w:pos="916"/>
+          <w:tab w:val="left" w:pos="1832"/>
+          <w:tab w:val="left" w:pos="2748"/>
+          <w:tab w:val="left" w:pos="3664"/>
+          <w:tab w:val="left" w:pos="4580"/>
+          <w:tab w:val="left" w:pos="5496"/>
+          <w:tab w:val="left" w:pos="6412"/>
+          <w:tab w:val="left" w:pos="7328"/>
+          <w:tab w:val="left" w:pos="8244"/>
+          <w:tab w:val="left" w:pos="9160"/>
+          <w:tab w:val="left" w:pos="10076"/>
+          <w:tab w:val="left" w:pos="10992"/>
+          <w:tab w:val="left" w:pos="11908"/>
+          <w:tab w:val="left" w:pos="12824"/>
+          <w:tab w:val="left" w:pos="13740"/>
+          <w:tab w:val="left" w:pos="14656"/>
+        </w:tabs>
+        <w:wordWrap w:val="0"/>
+        <w:spacing w:after="0" w:line="200" w:lineRule="atLeast"/>
+        <w:jc w:val="left"/>
+        <w:rPr>
+          <w:rFonts w:ascii="Lucida Console" w:eastAsia="Times New Roman" w:hAnsi="Lucida Console" w:cs="Courier New"/>
+          <w:color w:val="0070C0"/>
+          <w:sz w:val="20"/>
+          <w:szCs w:val="20"/>
+          <w:bdr w:val="none" w:sz="0" w:space="0" w:color="auto" w:frame="1"/>
+          <w:lang w:eastAsia="es-VE"/>
+        </w:rPr>
+      </w:pPr>
+      <w:r>
+        <w:rPr>
+          <w:rFonts w:ascii="Lucida Console" w:eastAsia="Times New Roman" w:hAnsi="Lucida Console" w:cs="Courier New"/>
+          <w:color w:val="0070C0"/>
+          <w:sz w:val="20"/>
+          <w:szCs w:val="20"/>
+          <w:bdr w:val="none" w:sz="0" w:space="0" w:color="auto" w:frame="1"/>
+          <w:lang w:eastAsia="es-VE"/>
+        </w:rPr>
+        <w:t xml:space="preserve">           </w:t>
+      </w:r>
+      <w:proofErr w:type="spellStart"/>
+      <w:proofErr w:type="gramStart"/>
+      <w:r>
+        <w:rPr>
+          <w:rFonts w:ascii="Lucida Console" w:eastAsia="Times New Roman" w:hAnsi="Lucida Console" w:cs="Courier New"/>
+          <w:color w:val="0070C0"/>
+          <w:sz w:val="20"/>
+          <w:szCs w:val="20"/>
+          <w:bdr w:val="none" w:sz="0" w:space="0" w:color="auto" w:frame="1"/>
+          <w:lang w:eastAsia="es-VE"/>
+        </w:rPr>
+        <w:t>setosa</w:t>
+      </w:r>
+      <w:proofErr w:type="spellEnd"/>
+      <w:proofErr w:type="gramEnd"/>
+      <w:r>
+        <w:rPr>
+          <w:rFonts w:ascii="Lucida Console" w:eastAsia="Times New Roman" w:hAnsi="Lucida Console" w:cs="Courier New"/>
+          <w:color w:val="0070C0"/>
+          <w:sz w:val="20"/>
+          <w:szCs w:val="20"/>
+          <w:bdr w:val="none" w:sz="0" w:space="0" w:color="auto" w:frame="1"/>
+          <w:lang w:eastAsia="es-VE"/>
+        </w:rPr>
+        <w:t xml:space="preserve"> </w:t>
+      </w:r>
+      <w:proofErr w:type="spellStart"/>
+      <w:r>
+        <w:rPr>
+          <w:rFonts w:ascii="Lucida Console" w:eastAsia="Times New Roman" w:hAnsi="Lucida Console" w:cs="Courier New"/>
+          <w:color w:val="0070C0"/>
+          <w:sz w:val="20"/>
+          <w:szCs w:val="20"/>
+          <w:bdr w:val="none" w:sz="0" w:space="0" w:color="auto" w:frame="1"/>
+          <w:lang w:eastAsia="es-VE"/>
+        </w:rPr>
+        <w:t>versicolor</w:t>
+      </w:r>
+      <w:proofErr w:type="spellEnd"/>
+      <w:r>
+        <w:rPr>
+          <w:rFonts w:ascii="Lucida Console" w:eastAsia="Times New Roman" w:hAnsi="Lucida Console" w:cs="Courier New"/>
+          <w:color w:val="0070C0"/>
+          <w:sz w:val="20"/>
+          <w:szCs w:val="20"/>
+          <w:bdr w:val="none" w:sz="0" w:space="0" w:color="auto" w:frame="1"/>
+          <w:lang w:eastAsia="es-VE"/>
+        </w:rPr>
+        <w:t xml:space="preserve"> </w:t>
+      </w:r>
+      <w:proofErr w:type="spellStart"/>
+      <w:r>
+        <w:rPr>
+          <w:rFonts w:ascii="Lucida Console" w:eastAsia="Times New Roman" w:hAnsi="Lucida Console" w:cs="Courier New"/>
+          <w:color w:val="0070C0"/>
+          <w:sz w:val="20"/>
+          <w:szCs w:val="20"/>
+          <w:bdr w:val="none" w:sz="0" w:space="0" w:color="auto" w:frame="1"/>
+          <w:lang w:eastAsia="es-VE"/>
+        </w:rPr>
+        <w:t>virginica</w:t>
+      </w:r>
+      <w:proofErr w:type="spellEnd"/>
+      <w:r>
+        <w:rPr>
+          <w:rFonts w:ascii="Lucida Console" w:eastAsia="Times New Roman" w:hAnsi="Lucida Console" w:cs="Courier New"/>
+          <w:color w:val="0070C0"/>
+          <w:sz w:val="20"/>
+          <w:szCs w:val="20"/>
+          <w:bdr w:val="none" w:sz="0" w:space="0" w:color="auto" w:frame="1"/>
+          <w:lang w:eastAsia="es-VE"/>
+        </w:rPr>
+        <w:t xml:space="preserve"> </w:t>
+      </w:r>
+      <w:proofErr w:type="spellStart"/>
+      <w:r>
+        <w:rPr>
+          <w:rFonts w:ascii="Lucida Console" w:eastAsia="Times New Roman" w:hAnsi="Lucida Console" w:cs="Courier New"/>
+          <w:color w:val="0070C0"/>
+          <w:sz w:val="20"/>
+          <w:szCs w:val="20"/>
+          <w:bdr w:val="none" w:sz="0" w:space="0" w:color="auto" w:frame="1"/>
+          <w:lang w:eastAsia="es-VE"/>
+        </w:rPr>
+        <w:t>class.error</w:t>
+      </w:r>
+      <w:proofErr w:type="spellEnd"/>
+    </w:p>
+    <w:p>
+      <w:pPr>
+        <w:shd w:val="clear" w:color="auto" w:fill="FFFFFF"/>
+        <w:tabs>
+          <w:tab w:val="left" w:pos="916"/>
+          <w:tab w:val="left" w:pos="1832"/>
+          <w:tab w:val="left" w:pos="2748"/>
+          <w:tab w:val="left" w:pos="3664"/>
+          <w:tab w:val="left" w:pos="4580"/>
+          <w:tab w:val="left" w:pos="5496"/>
+          <w:tab w:val="left" w:pos="6412"/>
+          <w:tab w:val="left" w:pos="7328"/>
+          <w:tab w:val="left" w:pos="8244"/>
+          <w:tab w:val="left" w:pos="9160"/>
+          <w:tab w:val="left" w:pos="10076"/>
+          <w:tab w:val="left" w:pos="10992"/>
+          <w:tab w:val="left" w:pos="11908"/>
+          <w:tab w:val="left" w:pos="12824"/>
+          <w:tab w:val="left" w:pos="13740"/>
+          <w:tab w:val="left" w:pos="14656"/>
+        </w:tabs>
+        <w:wordWrap w:val="0"/>
+        <w:spacing w:after="0" w:line="200" w:lineRule="atLeast"/>
+        <w:jc w:val="left"/>
+        <w:rPr>
+          <w:rFonts w:ascii="Lucida Console" w:eastAsia="Times New Roman" w:hAnsi="Lucida Console" w:cs="Courier New"/>
+          <w:color w:val="0070C0"/>
+          <w:sz w:val="20"/>
+          <w:szCs w:val="20"/>
+          <w:bdr w:val="none" w:sz="0" w:space="0" w:color="auto" w:frame="1"/>
+          <w:lang w:eastAsia="es-VE"/>
+        </w:rPr>
+      </w:pPr>
+      <w:proofErr w:type="spellStart"/>
+      <w:proofErr w:type="gramStart"/>
+      <w:r>
+        <w:rPr>
+          <w:rFonts w:ascii="Lucida Console" w:eastAsia="Times New Roman" w:hAnsi="Lucida Console" w:cs="Courier New"/>
+          <w:color w:val="0070C0"/>
+          <w:sz w:val="20"/>
+          <w:szCs w:val="20"/>
+          <w:bdr w:val="none" w:sz="0" w:space="0" w:color="auto" w:frame="1"/>
+          <w:lang w:eastAsia="es-VE"/>
+        </w:rPr>
+        <w:t>setosa</w:t>
+      </w:r>
+      <w:proofErr w:type="spellEnd"/>
+      <w:proofErr w:type="gramEnd"/>
+      <w:r>
+        <w:rPr>
+          <w:rFonts w:ascii="Lucida Console" w:eastAsia="Times New Roman" w:hAnsi="Lucida Console" w:cs="Courier New"/>
+          <w:color w:val="0070C0"/>
+          <w:sz w:val="20"/>
+          <w:szCs w:val="20"/>
+          <w:bdr w:val="none" w:sz="0" w:space="0" w:color="auto" w:frame="1"/>
+          <w:lang w:eastAsia="es-VE"/>
+        </w:rPr>
+        <w:t xml:space="preserve">         50          0         0        0.00</w:t>
+      </w:r>
+    </w:p>
+    <w:p>
+      <w:pPr>
+        <w:shd w:val="clear" w:color="auto" w:fill="FFFFFF"/>
+        <w:tabs>
+          <w:tab w:val="left" w:pos="916"/>
+          <w:tab w:val="left" w:pos="1832"/>
+          <w:tab w:val="left" w:pos="2748"/>
+          <w:tab w:val="left" w:pos="3664"/>
+          <w:tab w:val="left" w:pos="4580"/>
+          <w:tab w:val="left" w:pos="5496"/>
+          <w:tab w:val="left" w:pos="6412"/>
+          <w:tab w:val="left" w:pos="7328"/>
+          <w:tab w:val="left" w:pos="8244"/>
+          <w:tab w:val="left" w:pos="9160"/>
+          <w:tab w:val="left" w:pos="10076"/>
+          <w:tab w:val="left" w:pos="10992"/>
+          <w:tab w:val="left" w:pos="11908"/>
+          <w:tab w:val="left" w:pos="12824"/>
+          <w:tab w:val="left" w:pos="13740"/>
+          <w:tab w:val="left" w:pos="14656"/>
+        </w:tabs>
+        <w:wordWrap w:val="0"/>
+        <w:spacing w:after="0" w:line="200" w:lineRule="atLeast"/>
+        <w:jc w:val="left"/>
+        <w:rPr>
+          <w:rFonts w:ascii="Lucida Console" w:eastAsia="Times New Roman" w:hAnsi="Lucida Console" w:cs="Courier New"/>
+          <w:color w:val="0070C0"/>
+          <w:sz w:val="20"/>
+          <w:szCs w:val="20"/>
+          <w:bdr w:val="none" w:sz="0" w:space="0" w:color="auto" w:frame="1"/>
+          <w:lang w:eastAsia="es-VE"/>
+        </w:rPr>
+      </w:pPr>
+      <w:proofErr w:type="spellStart"/>
+      <w:proofErr w:type="gramStart"/>
+      <w:r>
+        <w:rPr>
+          <w:rFonts w:ascii="Lucida Console" w:eastAsia="Times New Roman" w:hAnsi="Lucida Console" w:cs="Courier New"/>
+          <w:color w:val="0070C0"/>
+          <w:sz w:val="20"/>
+          <w:szCs w:val="20"/>
+          <w:bdr w:val="none" w:sz="0" w:space="0" w:color="auto" w:frame="1"/>
+          <w:lang w:eastAsia="es-VE"/>
+        </w:rPr>
+        <w:t>versicolor</w:t>
+      </w:r>
+      <w:proofErr w:type="spellEnd"/>
+      <w:proofErr w:type="gramEnd"/>
+      <w:r>
+        <w:rPr>
+          <w:rFonts w:ascii="Lucida Console" w:eastAsia="Times New Roman" w:hAnsi="Lucida Console" w:cs="Courier New"/>
+          <w:color w:val="0070C0"/>
+          <w:sz w:val="20"/>
+          <w:szCs w:val="20"/>
+          <w:bdr w:val="none" w:sz="0" w:space="0" w:color="auto" w:frame="1"/>
+          <w:lang w:eastAsia="es-VE"/>
+        </w:rPr>
+        <w:t xml:space="preserve">      0         47         3        0.06</w:t>
+      </w:r>
+    </w:p>
+    <w:p>
+      <w:pPr>
+        <w:shd w:val="clear" w:color="auto" w:fill="FFFFFF"/>
+        <w:tabs>
+          <w:tab w:val="left" w:pos="916"/>
+          <w:tab w:val="left" w:pos="1832"/>
+          <w:tab w:val="left" w:pos="2748"/>
+          <w:tab w:val="left" w:pos="3664"/>
+          <w:tab w:val="left" w:pos="4580"/>
+          <w:tab w:val="left" w:pos="5496"/>
+          <w:tab w:val="left" w:pos="6412"/>
+          <w:tab w:val="left" w:pos="7328"/>
+          <w:tab w:val="left" w:pos="8244"/>
+          <w:tab w:val="left" w:pos="9160"/>
+          <w:tab w:val="left" w:pos="10076"/>
+          <w:tab w:val="left" w:pos="10992"/>
+          <w:tab w:val="left" w:pos="11908"/>
+          <w:tab w:val="left" w:pos="12824"/>
+          <w:tab w:val="left" w:pos="13740"/>
+          <w:tab w:val="left" w:pos="14656"/>
+        </w:tabs>
+        <w:wordWrap w:val="0"/>
+        <w:spacing w:after="0" w:line="200" w:lineRule="atLeast"/>
+        <w:jc w:val="left"/>
+        <w:rPr>
+          <w:rFonts w:ascii="Lucida Console" w:eastAsia="Times New Roman" w:hAnsi="Lucida Console" w:cs="Courier New"/>
+          <w:color w:val="0070C0"/>
+          <w:sz w:val="20"/>
+          <w:szCs w:val="20"/>
+          <w:lang w:eastAsia="es-VE"/>
+        </w:rPr>
+      </w:pPr>
+      <w:proofErr w:type="spellStart"/>
+      <w:proofErr w:type="gramStart"/>
+      <w:r>
+        <w:rPr>
+          <w:rFonts w:ascii="Lucida Console" w:eastAsia="Times New Roman" w:hAnsi="Lucida Console" w:cs="Courier New"/>
+          <w:color w:val="0070C0"/>
+          <w:sz w:val="20"/>
+          <w:szCs w:val="20"/>
+          <w:bdr w:val="none" w:sz="0" w:space="0" w:color="auto" w:frame="1"/>
+          <w:lang w:eastAsia="es-VE"/>
+        </w:rPr>
+        <w:t>virginica</w:t>
+      </w:r>
+      <w:proofErr w:type="spellEnd"/>
+      <w:proofErr w:type="gramEnd"/>
+      <w:r>
+        <w:rPr>
+          <w:rFonts w:ascii="Lucida Console" w:eastAsia="Times New Roman" w:hAnsi="Lucida Console" w:cs="Courier New"/>
+          <w:color w:val="0070C0"/>
+          <w:sz w:val="20"/>
+          <w:szCs w:val="20"/>
+          <w:bdr w:val="none" w:sz="0" w:space="0" w:color="auto" w:frame="1"/>
+          <w:lang w:eastAsia="es-VE"/>
+        </w:rPr>
+        <w:t xml:space="preserve">       0          3        47        0.06</w:t>
+      </w:r>
+    </w:p>
+    <w:p>
+      <w:pPr>
+        <w:shd w:val="clear" w:color="auto" w:fill="FFFFFF"/>
+        <w:tabs>
+          <w:tab w:val="left" w:pos="916"/>
+          <w:tab w:val="left" w:pos="1832"/>
+          <w:tab w:val="left" w:pos="2748"/>
+          <w:tab w:val="left" w:pos="3664"/>
+          <w:tab w:val="left" w:pos="4580"/>
+          <w:tab w:val="left" w:pos="5496"/>
+          <w:tab w:val="left" w:pos="6412"/>
+          <w:tab w:val="left" w:pos="7328"/>
+          <w:tab w:val="left" w:pos="8244"/>
+          <w:tab w:val="left" w:pos="9160"/>
+          <w:tab w:val="left" w:pos="10076"/>
+          <w:tab w:val="left" w:pos="10992"/>
+          <w:tab w:val="left" w:pos="11908"/>
+          <w:tab w:val="left" w:pos="12824"/>
+          <w:tab w:val="left" w:pos="13740"/>
+          <w:tab w:val="left" w:pos="14656"/>
+        </w:tabs>
+        <w:wordWrap w:val="0"/>
+        <w:spacing w:after="0" w:line="240" w:lineRule="atLeast"/>
+        <w:jc w:val="left"/>
+      </w:pPr>
+    </w:p>
+    <w:p>
+      <w:pPr>
+        <w:rPr>
+          <w:shd w:val="clear" w:color="auto" w:fill="FFFFFF"/>
+        </w:rPr>
+      </w:pPr>
+      <w:r>
+        <w:rPr>
+          <w:highlight w:val="yellow"/>
+          <w:shd w:val="clear" w:color="auto" w:fill="FFFFFF"/>
+        </w:rPr>
+        <w:t>Aquí</w:t>
+      </w:r>
+      <w:r>
+        <w:rPr>
+          <w:shd w:val="clear" w:color="auto" w:fill="FFFFFF"/>
+        </w:rPr>
+        <w:t xml:space="preserve"> obtenemos la información sobre </w:t>
+      </w:r>
+      <w:r>
+        <w:rPr>
+          <w:highlight w:val="yellow"/>
+          <w:shd w:val="clear" w:color="auto" w:fill="FFFFFF"/>
+        </w:rPr>
+        <w:t>cómo</w:t>
+      </w:r>
+      <w:r>
+        <w:rPr>
+          <w:shd w:val="clear" w:color="auto" w:fill="FFFFFF"/>
+        </w:rPr>
+        <w:t xml:space="preserve"> se </w:t>
+      </w:r>
+      <w:r>
+        <w:rPr>
+          <w:highlight w:val="yellow"/>
+          <w:shd w:val="clear" w:color="auto" w:fill="FFFFFF"/>
+        </w:rPr>
+        <w:t>construyó</w:t>
+      </w:r>
+      <w:r>
+        <w:rPr>
+          <w:shd w:val="clear" w:color="auto" w:fill="FFFFFF"/>
+        </w:rPr>
+        <w:t xml:space="preserve"> el modelo y </w:t>
+      </w:r>
+      <w:r>
+        <w:rPr>
+          <w:highlight w:val="yellow"/>
+          <w:shd w:val="clear" w:color="auto" w:fill="FFFFFF"/>
+        </w:rPr>
+        <w:t>la</w:t>
+      </w:r>
+      <w:r>
+        <w:rPr>
+          <w:shd w:val="clear" w:color="auto" w:fill="FFFFFF"/>
+        </w:rPr>
+        <w:t xml:space="preserve"> clasificación de los datos. </w:t>
+      </w:r>
+      <w:r>
+        <w:rPr>
+          <w:highlight w:val="yellow"/>
+          <w:shd w:val="clear" w:color="auto" w:fill="FFFFFF"/>
+        </w:rPr>
+        <w:t>En el</w:t>
+      </w:r>
+      <w:r>
+        <w:rPr>
+          <w:shd w:val="clear" w:color="auto" w:fill="FFFFFF"/>
+        </w:rPr>
+        <w:t xml:space="preserve"> </w:t>
+      </w:r>
+      <w:r>
+        <w:rPr>
+          <w:shd w:val="clear" w:color="auto" w:fill="FFFFFF"/>
+        </w:rPr>
+        <w:t xml:space="preserve">ejemplo </w:t>
+      </w:r>
+      <w:r>
+        <w:rPr>
+          <w:highlight w:val="yellow"/>
+          <w:shd w:val="clear" w:color="auto" w:fill="FFFFFF"/>
+        </w:rPr>
+        <w:t>notamos</w:t>
+      </w:r>
+      <w:r>
+        <w:rPr>
+          <w:shd w:val="clear" w:color="auto" w:fill="FFFFFF"/>
+        </w:rPr>
+        <w:t xml:space="preserve"> que el modelo es muy preciso. </w:t>
+      </w:r>
+      <w:r>
+        <w:rPr>
+          <w:highlight w:val="yellow"/>
+          <w:shd w:val="clear" w:color="auto" w:fill="FFFFFF"/>
+        </w:rPr>
+        <w:t>Las</w:t>
+      </w:r>
+      <w:r>
+        <w:rPr>
+          <w:shd w:val="clear" w:color="auto" w:fill="FFFFFF"/>
+        </w:rPr>
+        <w:t xml:space="preserve"> </w:t>
+      </w:r>
+      <w:r>
+        <w:rPr>
+          <w:highlight w:val="yellow"/>
+          <w:shd w:val="clear" w:color="auto" w:fill="FFFFFF"/>
+        </w:rPr>
+        <w:t>predicciones</w:t>
+      </w:r>
+      <w:r>
+        <w:rPr>
+          <w:highlight w:val="yellow"/>
+          <w:shd w:val="clear" w:color="auto" w:fill="FFFFFF"/>
+        </w:rPr>
+        <w:t xml:space="preserve"> </w:t>
+      </w:r>
+      <w:r>
+        <w:rPr>
+          <w:highlight w:val="yellow"/>
+          <w:shd w:val="clear" w:color="auto" w:fill="FFFFFF"/>
+        </w:rPr>
+        <w:t>la</w:t>
+      </w:r>
+      <w:r>
+        <w:rPr>
+          <w:highlight w:val="yellow"/>
+          <w:shd w:val="clear" w:color="auto" w:fill="FFFFFF"/>
+        </w:rPr>
+        <w:t xml:space="preserve"> hacemos</w:t>
+      </w:r>
+      <w:r>
+        <w:rPr>
+          <w:shd w:val="clear" w:color="auto" w:fill="FFFFFF"/>
+        </w:rPr>
+        <w:t xml:space="preserve"> de la manera habitual, usando la función </w:t>
+      </w:r>
+      <w:proofErr w:type="spellStart"/>
+      <w:proofErr w:type="gramStart"/>
+      <w:r>
+        <w:rPr>
+          <w:rStyle w:val="nfasis"/>
+          <w:rFonts w:ascii="Helvetica Neue" w:hAnsi="Helvetica Neue"/>
+          <w:color w:val="333333"/>
+          <w:spacing w:val="3"/>
+          <w:shd w:val="clear" w:color="auto" w:fill="FFFFFF"/>
+        </w:rPr>
+        <w:t>predict</w:t>
+      </w:r>
+      <w:proofErr w:type="spellEnd"/>
+      <w:r>
+        <w:rPr>
+          <w:rStyle w:val="nfasis"/>
+          <w:rFonts w:ascii="Helvetica Neue" w:hAnsi="Helvetica Neue"/>
+          <w:color w:val="333333"/>
+          <w:spacing w:val="3"/>
+          <w:shd w:val="clear" w:color="auto" w:fill="FFFFFF"/>
+        </w:rPr>
+        <w:t>(</w:t>
+      </w:r>
+      <w:proofErr w:type="gramEnd"/>
+      <w:r>
+        <w:rPr>
+          <w:rStyle w:val="nfasis"/>
+          <w:rFonts w:ascii="Helvetica Neue" w:hAnsi="Helvetica Neue"/>
+          <w:color w:val="333333"/>
+          <w:spacing w:val="3"/>
+          <w:shd w:val="clear" w:color="auto" w:fill="FFFFFF"/>
+        </w:rPr>
+        <w:t>)</w:t>
+      </w:r>
+      <w:r>
+        <w:rPr>
+          <w:rStyle w:val="nfasis"/>
+          <w:rFonts w:ascii="Helvetica Neue" w:hAnsi="Helvetica Neue"/>
+          <w:color w:val="333333"/>
+          <w:spacing w:val="3"/>
+          <w:shd w:val="clear" w:color="auto" w:fill="FFFFFF"/>
+        </w:rPr>
+        <w:t xml:space="preserve"> </w:t>
+      </w:r>
+      <w:r>
+        <w:rPr>
+          <w:highlight w:val="yellow"/>
+          <w:shd w:val="clear" w:color="auto" w:fill="FFFFFF"/>
+        </w:rPr>
+        <w:t>incorporando</w:t>
+      </w:r>
+      <w:r>
+        <w:rPr>
+          <w:shd w:val="clear" w:color="auto" w:fill="FFFFFF"/>
+        </w:rPr>
+        <w:t xml:space="preserve"> los </w:t>
+      </w:r>
+      <w:r>
+        <w:rPr>
+          <w:highlight w:val="yellow"/>
+          <w:shd w:val="clear" w:color="auto" w:fill="FFFFFF"/>
+        </w:rPr>
+        <w:t>parámetro</w:t>
+      </w:r>
+      <w:r>
+        <w:rPr>
+          <w:highlight w:val="yellow"/>
+          <w:shd w:val="clear" w:color="auto" w:fill="FFFFFF"/>
+        </w:rPr>
+        <w:t>s</w:t>
+      </w:r>
+      <w:r>
+        <w:rPr>
+          <w:shd w:val="clear" w:color="auto" w:fill="FFFFFF"/>
+        </w:rPr>
+        <w:t xml:space="preserve"> </w:t>
+      </w:r>
+      <w:r>
+        <w:rPr>
+          <w:highlight w:val="yellow"/>
+          <w:shd w:val="clear" w:color="auto" w:fill="FFFFFF"/>
+        </w:rPr>
+        <w:t>correspondientes</w:t>
+      </w:r>
+      <w:r>
+        <w:rPr>
+          <w:shd w:val="clear" w:color="auto" w:fill="FFFFFF"/>
+        </w:rPr>
+        <w:t xml:space="preserve"> al nombre del modelo y </w:t>
+      </w:r>
+      <w:r>
+        <w:rPr>
+          <w:highlight w:val="yellow"/>
+          <w:shd w:val="clear" w:color="auto" w:fill="FFFFFF"/>
+        </w:rPr>
+        <w:t>a</w:t>
+      </w:r>
+      <w:r>
+        <w:rPr>
+          <w:highlight w:val="yellow"/>
+          <w:shd w:val="clear" w:color="auto" w:fill="FFFFFF"/>
+        </w:rPr>
+        <w:t>l</w:t>
+      </w:r>
+      <w:r>
+        <w:rPr>
+          <w:shd w:val="clear" w:color="auto" w:fill="FFFFFF"/>
+        </w:rPr>
+        <w:t xml:space="preserve"> </w:t>
+      </w:r>
+      <w:r>
+        <w:rPr>
+          <w:highlight w:val="yellow"/>
+          <w:shd w:val="clear" w:color="auto" w:fill="FFFFFF"/>
+        </w:rPr>
+        <w:t xml:space="preserve">conjunto de </w:t>
+      </w:r>
+      <w:r>
+        <w:rPr>
+          <w:highlight w:val="yellow"/>
+          <w:shd w:val="clear" w:color="auto" w:fill="FFFFFF"/>
+        </w:rPr>
+        <w:t xml:space="preserve">nuevos </w:t>
+      </w:r>
+      <w:r>
+        <w:rPr>
+          <w:highlight w:val="yellow"/>
+          <w:shd w:val="clear" w:color="auto" w:fill="FFFFFF"/>
+        </w:rPr>
+        <w:t>datos</w:t>
+      </w:r>
+      <w:r>
+        <w:rPr>
+          <w:shd w:val="clear" w:color="auto" w:fill="FFFFFF"/>
+        </w:rPr>
+        <w:t>:</w:t>
+      </w:r>
+    </w:p>
+    <w:p>
+      <w:pPr>
+        <w:rPr>
+          <w:shd w:val="clear" w:color="auto" w:fill="FFFFFF"/>
+        </w:rPr>
+      </w:pPr>
+    </w:p>
+    <w:p>
+      <w:r>
+        <w:rPr>
+          <w:noProof/>
+          <w:lang w:eastAsia="es-VE"/>
+        </w:rPr>
+        <w:drawing>
+          <wp:inline distT="0" distB="0" distL="0" distR="0" wp14:anchorId="68568A3C" wp14:editId="30FAADAA">
+            <wp:extent cx="5612130" cy="1085593"/>
+            <wp:effectExtent l="0" t="0" r="0" b="635"/>
+            <wp:docPr id="45" name="Imagen 45" descr="C:\Users\Bernardo\Documents\Machine-Learning-Basico\docs\images\arb10.png"/>
+            <wp:cNvGraphicFramePr>
+              <a:graphicFrameLocks xmlns:a="http://schemas.openxmlformats.org/drawingml/2006/main" noChangeAspect="1"/>
+            </wp:cNvGraphicFramePr>
+            <a:graphic xmlns:a="http://schemas.openxmlformats.org/drawingml/2006/main">
+              <a:graphicData uri="http://schemas.openxmlformats.org/drawingml/2006/picture">
+                <pic:pic xmlns:pic="http://schemas.openxmlformats.org/drawingml/2006/picture">
+                  <pic:nvPicPr>
+                    <pic:cNvPr id="0" name="Picture 5" descr="C:\Users\Bernardo\Documents\Machine-Learning-Basico\docs\images\arb10.png"/>
+                    <pic:cNvPicPr>
+                      <a:picLocks noChangeAspect="1" noChangeArrowheads="1"/>
+                    </pic:cNvPicPr>
+                  </pic:nvPicPr>
+                  <pic:blipFill>
+                    <a:blip r:embed="rId51">
+                      <a:extLst>
+                        <a:ext uri="{28A0092B-C50C-407E-A947-70E740481C1C}">
+                          <a14:useLocalDpi xmlns:a14="http://schemas.microsoft.com/office/drawing/2010/main" val="0"/>
+                        </a:ext>
+                      </a:extLst>
+                    </a:blip>
+                    <a:srcRect/>
+                    <a:stretch>
+                      <a:fillRect/>
+                    </a:stretch>
+                  </pic:blipFill>
+                  <pic:spPr bwMode="auto">
+                    <a:xfrm>
+                      <a:off x="0" y="0"/>
+                      <a:ext cx="5612130" cy="1085593"/>
+                    </a:xfrm>
+                    <a:prstGeom prst="rect">
+                      <a:avLst/>
+                    </a:prstGeom>
+                    <a:noFill/>
+                    <a:ln>
+                      <a:noFill/>
+                    </a:ln>
+                  </pic:spPr>
+                </pic:pic>
+              </a:graphicData>
+            </a:graphic>
+          </wp:inline>
+        </w:drawing>
+      </w:r>
+    </w:p>
+    <w:p>
+      <w:pPr>
+        <w:shd w:val="clear" w:color="auto" w:fill="FFFFFF"/>
+        <w:tabs>
+          <w:tab w:val="left" w:pos="916"/>
+          <w:tab w:val="left" w:pos="1832"/>
+          <w:tab w:val="left" w:pos="2748"/>
+          <w:tab w:val="left" w:pos="3664"/>
+          <w:tab w:val="left" w:pos="4580"/>
+          <w:tab w:val="left" w:pos="5496"/>
+          <w:tab w:val="left" w:pos="6412"/>
+          <w:tab w:val="left" w:pos="7328"/>
+          <w:tab w:val="left" w:pos="8244"/>
+          <w:tab w:val="left" w:pos="9160"/>
+          <w:tab w:val="left" w:pos="10076"/>
+          <w:tab w:val="left" w:pos="10992"/>
+          <w:tab w:val="left" w:pos="11908"/>
+          <w:tab w:val="left" w:pos="12824"/>
+          <w:tab w:val="left" w:pos="13740"/>
+          <w:tab w:val="left" w:pos="14656"/>
+        </w:tabs>
+        <w:wordWrap w:val="0"/>
+        <w:spacing w:after="0" w:line="200" w:lineRule="atLeast"/>
+        <w:jc w:val="left"/>
+        <w:rPr>
+          <w:rFonts w:ascii="Lucida Console" w:eastAsia="Times New Roman" w:hAnsi="Lucida Console" w:cs="Courier New"/>
+          <w:color w:val="000000"/>
+          <w:sz w:val="20"/>
+          <w:szCs w:val="20"/>
+          <w:lang w:eastAsia="es-VE"/>
+        </w:rPr>
+      </w:pPr>
+      <w:proofErr w:type="spellStart"/>
+      <w:proofErr w:type="gramStart"/>
+      <w:r>
+        <w:rPr>
+          <w:rFonts w:ascii="Lucida Console" w:eastAsia="Times New Roman" w:hAnsi="Lucida Console" w:cs="Courier New"/>
+          <w:color w:val="0000FF"/>
+          <w:sz w:val="20"/>
+          <w:szCs w:val="20"/>
+          <w:lang w:eastAsia="es-VE"/>
+        </w:rPr>
+        <w:t>predict</w:t>
+      </w:r>
+      <w:proofErr w:type="spellEnd"/>
+      <w:r>
+        <w:rPr>
+          <w:rFonts w:ascii="Lucida Console" w:eastAsia="Times New Roman" w:hAnsi="Lucida Console" w:cs="Courier New"/>
+          <w:color w:val="0000FF"/>
+          <w:sz w:val="20"/>
+          <w:szCs w:val="20"/>
+          <w:lang w:eastAsia="es-VE"/>
+        </w:rPr>
+        <w:t>(</w:t>
+      </w:r>
+      <w:proofErr w:type="spellStart"/>
+      <w:proofErr w:type="gramEnd"/>
+      <w:r>
+        <w:rPr>
+          <w:rFonts w:ascii="Lucida Console" w:eastAsia="Times New Roman" w:hAnsi="Lucida Console" w:cs="Courier New"/>
+          <w:color w:val="0000FF"/>
+          <w:sz w:val="20"/>
+          <w:szCs w:val="20"/>
+          <w:lang w:eastAsia="es-VE"/>
+        </w:rPr>
+        <w:t>rf</w:t>
+      </w:r>
+      <w:proofErr w:type="spellEnd"/>
+      <w:r>
+        <w:rPr>
+          <w:rFonts w:ascii="Lucida Console" w:eastAsia="Times New Roman" w:hAnsi="Lucida Console" w:cs="Courier New"/>
+          <w:color w:val="0000FF"/>
+          <w:sz w:val="20"/>
+          <w:szCs w:val="20"/>
+          <w:lang w:eastAsia="es-VE"/>
+        </w:rPr>
+        <w:t>, iris[, 1:4])</w:t>
+      </w:r>
+    </w:p>
+    <w:p/>
+    <w:p/>
+    <w:p>
+      <w:pPr>
+        <w:shd w:val="clear" w:color="auto" w:fill="FFFFFF"/>
+        <w:spacing w:before="306" w:after="204" w:line="240" w:lineRule="auto"/>
+        <w:jc w:val="left"/>
+        <w:outlineLvl w:val="1"/>
+        <w:rPr>
+          <w:rFonts w:ascii="Helvetica Neue" w:eastAsia="Times New Roman" w:hAnsi="Helvetica Neue" w:cs="Times New Roman"/>
+          <w:color w:val="333333"/>
+          <w:spacing w:val="3"/>
+          <w:sz w:val="42"/>
+          <w:szCs w:val="42"/>
+          <w:lang w:eastAsia="es-VE"/>
+        </w:rPr>
+      </w:pPr>
+      <w:r>
+        <w:rPr>
+          <w:rFonts w:ascii="Helvetica Neue" w:eastAsia="Times New Roman" w:hAnsi="Helvetica Neue" w:cs="Times New Roman"/>
+          <w:color w:val="333333"/>
+          <w:spacing w:val="3"/>
+          <w:sz w:val="42"/>
+          <w:szCs w:val="42"/>
+          <w:lang w:eastAsia="es-VE"/>
+        </w:rPr>
+        <w:lastRenderedPageBreak/>
+        <w:t>8.4 Bosques aleatorios en </w:t>
+      </w:r>
+      <w:r>
+        <w:rPr>
+          <w:rFonts w:ascii="Helvetica Neue" w:eastAsia="Times New Roman" w:hAnsi="Helvetica Neue" w:cs="Times New Roman"/>
+          <w:i/>
+          <w:iCs/>
+          <w:color w:val="333333"/>
+          <w:spacing w:val="3"/>
+          <w:sz w:val="42"/>
+          <w:szCs w:val="42"/>
+          <w:lang w:eastAsia="es-VE"/>
+        </w:rPr>
+        <w:t>Python</w:t>
+      </w:r>
+    </w:p>
+    <w:p>
+      <w:pPr>
+        <w:rPr>
+          <w:rFonts w:ascii="Helvetica Neue" w:hAnsi="Helvetica Neue"/>
+          <w:color w:val="333333"/>
+          <w:spacing w:val="3"/>
+          <w:shd w:val="clear" w:color="auto" w:fill="FFFFFF"/>
+        </w:rPr>
+      </w:pPr>
+    </w:p>
+    <w:p>
+      <w:pPr>
+        <w:rPr>
+          <w:rFonts w:ascii="Helvetica Neue" w:hAnsi="Helvetica Neue"/>
+          <w:color w:val="333333"/>
+          <w:spacing w:val="3"/>
+          <w:shd w:val="clear" w:color="auto" w:fill="FFFFFF"/>
+        </w:rPr>
+      </w:pPr>
+      <w:r>
+        <w:rPr>
+          <w:rFonts w:ascii="Helvetica Neue" w:hAnsi="Helvetica Neue"/>
+          <w:color w:val="333333"/>
+          <w:spacing w:val="3"/>
+          <w:shd w:val="clear" w:color="auto" w:fill="FFFFFF"/>
+        </w:rPr>
+        <w:t>Debemos separar las variables independientes, en otra variable que llamaremos </w:t>
+      </w:r>
+      <w:r>
+        <w:rPr>
+          <w:rStyle w:val="nfasis"/>
+          <w:rFonts w:ascii="Helvetica Neue" w:hAnsi="Helvetica Neue"/>
+          <w:color w:val="333333"/>
+          <w:spacing w:val="3"/>
+          <w:shd w:val="clear" w:color="auto" w:fill="FFFFFF"/>
+        </w:rPr>
+        <w:t>predictores</w:t>
+      </w:r>
+      <w:r>
+        <w:rPr>
+          <w:rFonts w:ascii="Helvetica Neue" w:hAnsi="Helvetica Neue"/>
+          <w:color w:val="333333"/>
+          <w:spacing w:val="3"/>
+          <w:shd w:val="clear" w:color="auto" w:fill="FFFFFF"/>
+        </w:rPr>
+        <w:t xml:space="preserve">. </w:t>
+      </w:r>
+      <w:r>
+        <w:rPr>
+          <w:rFonts w:ascii="Helvetica Neue" w:hAnsi="Helvetica Neue"/>
+          <w:color w:val="333333"/>
+          <w:spacing w:val="3"/>
+          <w:highlight w:val="yellow"/>
+          <w:shd w:val="clear" w:color="auto" w:fill="FFFFFF"/>
+        </w:rPr>
+        <w:t xml:space="preserve">Como los </w:t>
+      </w:r>
+      <w:r>
+        <w:rPr>
+          <w:rFonts w:ascii="Helvetica Neue" w:hAnsi="Helvetica Neue"/>
+          <w:color w:val="333333"/>
+          <w:spacing w:val="3"/>
+          <w:highlight w:val="yellow"/>
+          <w:shd w:val="clear" w:color="auto" w:fill="FFFFFF"/>
+        </w:rPr>
+        <w:t xml:space="preserve">datos </w:t>
+      </w:r>
+      <w:r>
+        <w:rPr>
+          <w:rFonts w:ascii="Helvetica Neue" w:hAnsi="Helvetica Neue"/>
+          <w:color w:val="333333"/>
+          <w:spacing w:val="3"/>
+          <w:highlight w:val="yellow"/>
+          <w:shd w:val="clear" w:color="auto" w:fill="FFFFFF"/>
+        </w:rPr>
+        <w:t>carecen de</w:t>
+      </w:r>
+      <w:r>
+        <w:rPr>
+          <w:rFonts w:ascii="Helvetica Neue" w:hAnsi="Helvetica Neue"/>
+          <w:color w:val="333333"/>
+          <w:spacing w:val="3"/>
+          <w:highlight w:val="yellow"/>
+          <w:shd w:val="clear" w:color="auto" w:fill="FFFFFF"/>
+        </w:rPr>
+        <w:t xml:space="preserve"> la variable </w:t>
+      </w:r>
+      <w:proofErr w:type="spellStart"/>
+      <w:r>
+        <w:rPr>
+          <w:rStyle w:val="nfasis"/>
+          <w:rFonts w:ascii="Helvetica Neue" w:hAnsi="Helvetica Neue"/>
+          <w:color w:val="333333"/>
+          <w:spacing w:val="3"/>
+          <w:highlight w:val="yellow"/>
+          <w:shd w:val="clear" w:color="auto" w:fill="FFFFFF"/>
+        </w:rPr>
+        <w:t>species</w:t>
+      </w:r>
+      <w:proofErr w:type="spellEnd"/>
+      <w:r>
+        <w:rPr>
+          <w:rFonts w:ascii="Helvetica Neue" w:hAnsi="Helvetica Neue"/>
+          <w:color w:val="333333"/>
+          <w:spacing w:val="3"/>
+          <w:highlight w:val="yellow"/>
+          <w:shd w:val="clear" w:color="auto" w:fill="FFFFFF"/>
+        </w:rPr>
+        <w:t> </w:t>
+      </w:r>
+      <w:r>
+        <w:rPr>
+          <w:rFonts w:ascii="Helvetica Neue" w:hAnsi="Helvetica Neue"/>
+          <w:color w:val="333333"/>
+          <w:spacing w:val="3"/>
+          <w:highlight w:val="yellow"/>
+          <w:shd w:val="clear" w:color="auto" w:fill="FFFFFF"/>
+        </w:rPr>
+        <w:t xml:space="preserve">la </w:t>
+      </w:r>
+      <w:r>
+        <w:rPr>
+          <w:rFonts w:ascii="Helvetica Neue" w:hAnsi="Helvetica Neue"/>
+          <w:color w:val="333333"/>
+          <w:spacing w:val="3"/>
+          <w:highlight w:val="yellow"/>
+          <w:shd w:val="clear" w:color="auto" w:fill="FFFFFF"/>
+        </w:rPr>
+        <w:t>agregar</w:t>
+      </w:r>
+      <w:r>
+        <w:rPr>
+          <w:rFonts w:ascii="Helvetica Neue" w:hAnsi="Helvetica Neue"/>
+          <w:color w:val="333333"/>
+          <w:spacing w:val="3"/>
+          <w:highlight w:val="yellow"/>
+          <w:shd w:val="clear" w:color="auto" w:fill="FFFFFF"/>
+        </w:rPr>
+        <w:t>emos</w:t>
+      </w:r>
+      <w:r>
+        <w:rPr>
+          <w:rFonts w:ascii="Helvetica Neue" w:hAnsi="Helvetica Neue"/>
+          <w:color w:val="333333"/>
+          <w:spacing w:val="3"/>
+          <w:highlight w:val="yellow"/>
+          <w:shd w:val="clear" w:color="auto" w:fill="FFFFFF"/>
+        </w:rPr>
+        <w:t xml:space="preserve"> de la siguiente forma:</w:t>
+      </w:r>
+    </w:p>
+    <w:p>
+      <w:pPr>
+        <w:rPr>
+          <w:rFonts w:ascii="Helvetica Neue" w:hAnsi="Helvetica Neue"/>
+          <w:color w:val="333333"/>
+          <w:spacing w:val="3"/>
+          <w:shd w:val="clear" w:color="auto" w:fill="FFFFFF"/>
+        </w:rPr>
+      </w:pPr>
+    </w:p>
+    <w:p>
+      <w:r>
+        <w:rPr>
+          <w:rFonts w:ascii="Helvetica Neue" w:hAnsi="Helvetica Neue"/>
+          <w:color w:val="333333"/>
+          <w:spacing w:val="3"/>
+          <w:highlight w:val="yellow"/>
+          <w:shd w:val="clear" w:color="auto" w:fill="FFFFFF"/>
+        </w:rPr>
+        <w:t xml:space="preserve">Antes de construir el modelo, </w:t>
+      </w:r>
+      <w:r>
+        <w:rPr>
+          <w:rFonts w:ascii="Helvetica Neue" w:hAnsi="Helvetica Neue"/>
+          <w:color w:val="333333"/>
+          <w:spacing w:val="3"/>
+          <w:highlight w:val="yellow"/>
+          <w:shd w:val="clear" w:color="auto" w:fill="FFFFFF"/>
+        </w:rPr>
+        <w:t>asegura</w:t>
+      </w:r>
+      <w:r>
+        <w:rPr>
+          <w:rFonts w:ascii="Helvetica Neue" w:hAnsi="Helvetica Neue"/>
+          <w:color w:val="333333"/>
+          <w:spacing w:val="3"/>
+          <w:highlight w:val="yellow"/>
+          <w:shd w:val="clear" w:color="auto" w:fill="FFFFFF"/>
+        </w:rPr>
+        <w:t>m</w:t>
+      </w:r>
+      <w:r>
+        <w:rPr>
+          <w:rFonts w:ascii="Helvetica Neue" w:hAnsi="Helvetica Neue"/>
+          <w:color w:val="333333"/>
+          <w:spacing w:val="3"/>
+          <w:highlight w:val="yellow"/>
+          <w:shd w:val="clear" w:color="auto" w:fill="FFFFFF"/>
+        </w:rPr>
+        <w:t>os que la</w:t>
+      </w:r>
+      <w:r>
+        <w:rPr>
+          <w:rFonts w:ascii="Helvetica Neue" w:hAnsi="Helvetica Neue"/>
+          <w:color w:val="333333"/>
+          <w:spacing w:val="3"/>
+          <w:highlight w:val="yellow"/>
+          <w:shd w:val="clear" w:color="auto" w:fill="FFFFFF"/>
+        </w:rPr>
+        <w:t xml:space="preserve"> variable sea del tipo numérico c</w:t>
+      </w:r>
+      <w:r>
+        <w:rPr>
+          <w:rFonts w:ascii="Helvetica Neue" w:hAnsi="Helvetica Neue"/>
+          <w:color w:val="333333"/>
+          <w:spacing w:val="3"/>
+          <w:highlight w:val="yellow"/>
+          <w:shd w:val="clear" w:color="auto" w:fill="FFFFFF"/>
+        </w:rPr>
+        <w:t>on la función </w:t>
+      </w:r>
+      <w:proofErr w:type="spellStart"/>
+      <w:proofErr w:type="gramStart"/>
+      <w:r>
+        <w:rPr>
+          <w:rStyle w:val="nfasis"/>
+          <w:rFonts w:ascii="Helvetica Neue" w:hAnsi="Helvetica Neue"/>
+          <w:color w:val="333333"/>
+          <w:spacing w:val="3"/>
+          <w:highlight w:val="yellow"/>
+          <w:shd w:val="clear" w:color="auto" w:fill="FFFFFF"/>
+        </w:rPr>
+        <w:t>factorize</w:t>
+      </w:r>
+      <w:proofErr w:type="spellEnd"/>
+      <w:r>
+        <w:rPr>
+          <w:rFonts w:ascii="Helvetica Neue" w:hAnsi="Helvetica Neue"/>
+          <w:color w:val="333333"/>
+          <w:spacing w:val="3"/>
+          <w:highlight w:val="yellow"/>
+          <w:shd w:val="clear" w:color="auto" w:fill="FFFFFF"/>
+        </w:rPr>
+        <w:t> </w:t>
+      </w:r>
+      <w:r>
+        <w:rPr>
+          <w:rFonts w:ascii="Helvetica Neue" w:hAnsi="Helvetica Neue"/>
+          <w:color w:val="333333"/>
+          <w:spacing w:val="3"/>
+          <w:highlight w:val="yellow"/>
+          <w:shd w:val="clear" w:color="auto" w:fill="FFFFFF"/>
+        </w:rPr>
+        <w:t>:</w:t>
+      </w:r>
+      <w:bookmarkStart w:id="0" w:name="_GoBack"/>
+      <w:bookmarkEnd w:id="0"/>
+      <w:proofErr w:type="gramEnd"/>
+      <w:r>
+        <w:t xml:space="preserve"> </w:t>
+      </w:r>
       <w:r>
         <w:br w:type="page"/>
       </w:r>
@@ -32081,6 +34986,22 @@
     <w:basedOn w:val="Fuentedeprrafopredeter"/>
     <w:rsid w:val="008825D9"/>
   </w:style>
+  <w:style w:type="paragraph" w:customStyle="1" w:styleId="Default">
+    <w:name w:val="Default"/>
+    <w:rsid w:val="00D15761"/>
+    <w:pPr>
+      <w:autoSpaceDE w:val="0"/>
+      <w:autoSpaceDN w:val="0"/>
+      <w:adjustRightInd w:val="0"/>
+      <w:spacing w:after="0" w:line="240" w:lineRule="auto"/>
+    </w:pPr>
+    <w:rPr>
+      <w:rFonts w:ascii="Myriad Pro" w:hAnsi="Myriad Pro" w:cs="Myriad Pro"/>
+      <w:color w:val="000000"/>
+      <w:sz w:val="24"/>
+      <w:szCs w:val="24"/>
+    </w:rPr>
+  </w:style>
 </w:styles>
 </file>
 
@@ -32350,7 +35271,7 @@
 </file>
 
 <file path=customXml/itemProps1.xml><?xml version="1.0" encoding="utf-8"?>
-<ds:datastoreItem xmlns:ds="http://schemas.openxmlformats.org/officeDocument/2006/customXml" ds:itemID="{165E01BB-D179-4948-93B5-4324B730D93B}">
+<ds:datastoreItem xmlns:ds="http://schemas.openxmlformats.org/officeDocument/2006/customXml" ds:itemID="{EAC4FF8F-7DF0-404F-A610-99FD44CC10E1}">
   <ds:schemaRefs>
     <ds:schemaRef ds:uri="http://schemas.openxmlformats.org/officeDocument/2006/bibliography"/>
   </ds:schemaRefs>

</xml_diff>